<commit_message>
feat: add interactive navbar dropdown for sub-domains (pp, md, mt) and mobile drawer
</commit_message>
<xml_diff>
--- a/PROPOSAL_SCALE_UP_WEBSITE_AL_IHYA.docx
+++ b/PROPOSAL_SCALE_UP_WEBSITE_AL_IHYA.docx
@@ -2172,6 +2172,38 @@
           <w:szCs w:val="22"/>
         </w:rPr>
         <w:t xml:space="preserve">A. Portal Utama Lembaga (majlisalihyabogor.id)</w:t>
+      </w:r>
+    </w:p>
+    <w:p>
+      <w:pPr>
+        <w:ind w:left="360" w:hanging="240"/>
+        <w:spacing w:before="60" w:after="60" w:line="260" w:lineRule="auto"/>
+      </w:pPr>
+      <w:r>
+        <w:rPr>
+          <w:b/>
+          <w:color w:val="1B4D3E"/>
+          <w:sz w:val="22"/>
+          <w:szCs w:val="22"/>
+        </w:rPr>
+        <w:t xml:space="preserve">•  </w:t>
+      </w:r>
+      <w:r>
+        <w:rPr>
+          <w:b/>
+          <w:color w:val="222222"/>
+          <w:sz w:val="22"/>
+          <w:szCs w:val="22"/>
+        </w:rPr>
+        <w:t xml:space="preserve">Navbar Terpadu &amp; Menu Dropdown Sub-Website: </w:t>
+      </w:r>
+      <w:r>
+        <w:rPr>
+          <w:color w:val="444444"/>
+          <w:sz w:val="22"/>
+          <w:szCs w:val="22"/>
+        </w:rPr>
+        <w:t xml:space="preserve">Bilah navigasi utama (Navbar) dilengkapi menu dropdown responsif 'Unit Sub-Website' yang memungkinkan pengunjung langsung melompat ke Pondok Pesantren (pp.majlisalihyabogor.id), Madrasah Diniah (md.majlisalihyabogor.id), atau Majelis Taklim (mt.majlisalihyabogor.id) dari halaman mana saja tanpa harus kembali ke beranda, lengkap dengan drawer menu responsif pada layar smartphone.</w:t>
       </w:r>
     </w:p>
     <w:p>

</xml_diff>

<commit_message>
feat: complete Pondok Pesantren portal (pp.) - education, daily schedule, dorm facilities, achievements, alumni & ePesantren link
</commit_message>
<xml_diff>
--- a/PROPOSAL_SCALE_UP_WEBSITE_AL_IHYA.docx
+++ b/PROPOSAL_SCALE_UP_WEBSITE_AL_IHYA.docx
@@ -2379,7 +2379,7 @@
           <w:sz w:val="22"/>
           <w:szCs w:val="22"/>
         </w:rPr>
-        <w:t xml:space="preserve">Hero banner pesantren, sekilas profil santri, keunggulan program kepesantrenan, dan tombol pintas pendaftaran santri baru (PPDB).</w:t>
+        <w:t xml:space="preserve">Hero banner pesantren (Nama Lembaga &amp; Tagline), sekilas profil santri, keunggulan program kepesantrenan, dan tombol pintas pendaftaran santri baru (PPDB).</w:t>
       </w:r>
     </w:p>
     <w:p>
@@ -2411,7 +2411,7 @@
           <w:sz w:val="22"/>
           <w:szCs w:val="22"/>
         </w:rPr>
-        <w:t xml:space="preserve">Sejarah pendirian ponpes, visi &amp; misi kepesantrenan, serta profil Dewan Kyai, Pengasuh Asrama, dan Dewan Asatidz.</w:t>
+        <w:t xml:space="preserve">Memuat Profil Pesantren (sejarah pendirian, visi dan misi kepesantrenan) serta Profil Pengurus (Dewan Kyai, Pengasuh Asrama, dan Dewan Asatidz).</w:t>
       </w:r>
     </w:p>
     <w:p>
@@ -2435,7 +2435,7 @@
           <w:sz w:val="22"/>
           <w:szCs w:val="22"/>
         </w:rPr>
-        <w:t xml:space="preserve">Program Pendidikan: </w:t>
+        <w:t xml:space="preserve">Pendidikan: </w:t>
       </w:r>
       <w:r>
         <w:rPr>
@@ -2443,7 +2443,7 @@
           <w:sz w:val="22"/>
           <w:szCs w:val="22"/>
         </w:rPr>
-        <w:t xml:space="preserve">Kurikulum kepesantrenan (Tahfidzul Qur'an, Kajian Kitab Kuning Turats, Bahasa Arab &amp; Inggris), jadwal rutinitas harian santri, dan kegiatan ekstrakurikuler.</w:t>
+        <w:t xml:space="preserve">Informasi Program Pendidikan, Program Unggulan (Tahfidzul Qur'an 30 Juz, Kitab Kuning Turats, Bilingual Arabic &amp; English), Struktur Kurikulum, serta Jadwal Pendidikan (Rutinitas Kegiatan Harian Santri dari bangun tidur hingga istirahat malam).</w:t>
       </w:r>
     </w:p>
     <w:p>
@@ -2467,7 +2467,7 @@
           <w:sz w:val="22"/>
           <w:szCs w:val="22"/>
         </w:rPr>
-        <w:t xml:space="preserve">Tata Tertib Santri: </w:t>
+        <w:t xml:space="preserve">Kehidupan Santri: </w:t>
       </w:r>
       <w:r>
         <w:rPr>
@@ -2475,7 +2475,7 @@
           <w:sz w:val="22"/>
           <w:szCs w:val="22"/>
         </w:rPr>
-        <w:t xml:space="preserve">Panduan tata tertib santri asrama, disiplin peribadatan sholat berjamaah, aturan komunikasi/gawai, jam berkunjung wali santri, dan etika penuntut ilmu.</w:t>
+        <w:t xml:space="preserve">Informasi Fasilitas Asrama (kamar santri, masjid, perpustakaan kitab, ruang makan, sarana olahraga, pos kesehatan santri) serta Tata Tertib Santri (disiplin sholat berjamaah &amp; tahajjud, tata tertib jam belajar, aturan ketat larangan gawai/smartphone pribadi, dan etika thalabul 'ilmi).</w:t>
       </w:r>
     </w:p>
     <w:p>
@@ -2499,7 +2499,7 @@
           <w:sz w:val="22"/>
           <w:szCs w:val="22"/>
         </w:rPr>
-        <w:t xml:space="preserve">Galeri Dokumentasi: </w:t>
+        <w:t xml:space="preserve">Prestasi &amp; Alumni: </w:t>
       </w:r>
       <w:r>
         <w:rPr>
@@ -2507,7 +2507,7 @@
           <w:sz w:val="22"/>
           <w:szCs w:val="22"/>
         </w:rPr>
-        <w:t xml:space="preserve">Galeri foto kegiatan santri, sarana prasarana asrama, dan galeri video YouTube (liputan haul akbar, imtihan, khataman, dan rihlah ilmiah).</w:t>
+        <w:t xml:space="preserve">Dokumentasi Prestasi Santri (kejuaraan MTQ, lomba Musabaqah Qira'atil Kutub / MQK, pidato bahasa asing) serta Testimoni Alumni (profil keberhasilan alumni di Al-Azhar Kairo, perguruan tinggi Islam nasional, dan kiprah dakwah di masyarakat).</w:t>
       </w:r>
     </w:p>
     <w:p>
@@ -2531,7 +2531,7 @@
           <w:sz w:val="22"/>
           <w:szCs w:val="22"/>
         </w:rPr>
-        <w:t xml:space="preserve">Informasi &amp; Pengumuman: </w:t>
+        <w:t xml:space="preserve">Galeri Dokumentasi: </w:t>
       </w:r>
       <w:r>
         <w:rPr>
@@ -2539,7 +2539,7 @@
           <w:sz w:val="22"/>
           <w:szCs w:val="22"/>
         </w:rPr>
-        <w:t xml:space="preserve">Pengumuman akademik santri, agenda libur/kepulangan santri, dan warta kegiatan pesantren.</w:t>
+        <w:t xml:space="preserve">Galeri Foto kegiatan keseharian asrama dan Galeri Video YouTube (liputan haul akbar, imtihan santri, khataman Al-Qur'an, dan rihlah ilmiah).</w:t>
       </w:r>
     </w:p>
     <w:p>
@@ -2563,7 +2563,7 @@
           <w:sz w:val="22"/>
           <w:szCs w:val="22"/>
         </w:rPr>
-        <w:t xml:space="preserve">Pendaftaran Santri Baru (PPDB): </w:t>
+        <w:t xml:space="preserve">Informasi Lembaga: </w:t>
       </w:r>
       <w:r>
         <w:rPr>
@@ -2571,7 +2571,7 @@
           <w:sz w:val="22"/>
           <w:szCs w:val="22"/>
         </w:rPr>
-        <w:t xml:space="preserve">Alur pendaftaran, persyaratan berkas, jadwal tes/gelombang seleksi, rincian biaya pendidikan, serta tautan formulir pendaftaran online.</w:t>
+        <w:t xml:space="preserve">Pengumuman akademik santri, jadwal kepulangan/libur santri, serta warta berita terkini kegiatan pesantren.</w:t>
       </w:r>
     </w:p>
     <w:p>
@@ -2595,7 +2595,7 @@
           <w:sz w:val="22"/>
           <w:szCs w:val="22"/>
         </w:rPr>
-        <w:t xml:space="preserve">Kontak &amp; Lokasi: </w:t>
+        <w:t xml:space="preserve">Pendaftaran Santri Baru (PPDB): </w:t>
       </w:r>
       <w:r>
         <w:rPr>
@@ -2603,7 +2603,7 @@
           <w:sz w:val="22"/>
           <w:szCs w:val="22"/>
         </w:rPr>
-        <w:t xml:space="preserve">Hotline sekretariat pesantren, kontak pengasuh asrama, denah lokasi, dan Google Maps interaktif.</w:t>
+        <w:t xml:space="preserve">Panduan alur pendaftaran, persyaratan dokumen, jadwal gelombang tes seleksi, rincian biaya pendidikan, serta integrasi tombol langsung menuju formulir pendaftaran PPDB online.</w:t>
       </w:r>
     </w:p>
     <w:p>
@@ -2627,7 +2627,7 @@
           <w:sz w:val="22"/>
           <w:szCs w:val="22"/>
         </w:rPr>
-        <w:t xml:space="preserve">Tautan Silang (Cross-Links): </w:t>
+        <w:t xml:space="preserve">Kontak &amp; Lokasi: </w:t>
       </w:r>
       <w:r>
         <w:rPr>
@@ -2635,7 +2635,39 @@
           <w:sz w:val="22"/>
           <w:szCs w:val="22"/>
         </w:rPr>
-        <w:t xml:space="preserve">Tautan media sosial resmi serta tautan navigasi langsung ke Website Utama, Madrasah Diniah (md.), dan Majelis Taklim (mt.).</w:t>
+        <w:t xml:space="preserve">Hotline sekretariat ponpes, kontak pengasuh asrama, informasi alamat lengkap, dan peta Google Maps interaktif.</w:t>
+      </w:r>
+    </w:p>
+    <w:p>
+      <w:pPr>
+        <w:ind w:left="360" w:hanging="240"/>
+        <w:spacing w:before="60" w:after="60" w:line="260" w:lineRule="auto"/>
+      </w:pPr>
+      <w:r>
+        <w:rPr>
+          <w:b/>
+          <w:color w:val="1B4D3E"/>
+          <w:sz w:val="22"/>
+          <w:szCs w:val="22"/>
+        </w:rPr>
+        <w:t xml:space="preserve">•  </w:t>
+      </w:r>
+      <w:r>
+        <w:rPr>
+          <w:b/>
+          <w:color w:val="222222"/>
+          <w:sz w:val="22"/>
+          <w:szCs w:val="22"/>
+        </w:rPr>
+        <w:t xml:space="preserve">Fitur Tambahan &amp; Integrasi Eksternal: </w:t>
+      </w:r>
+      <w:r>
+        <w:rPr>
+          <w:color w:val="444444"/>
+          <w:sz w:val="22"/>
+          <w:szCs w:val="22"/>
+        </w:rPr>
+        <w:t xml:space="preserve">Tautan Media Sosial resmi (Instagram, YouTube), Tautan Silang (Cross-Links) ke Website Utama, Madrasah Diniah (md.), Majelis Taklim (mt.), serta Tautan Khusus ke Sistem Manajemen Santri ePesantren (Aplikasi Eksternal).</w:t>
       </w:r>
     </w:p>
     <w:p>

</xml_diff>

<commit_message>
feat: complete Madrasah Diniah portal (md.) with all 9 competitor sections, quick directory bar, and ePesantren out-of-scope note
</commit_message>
<xml_diff>
--- a/PROPOSAL_SCALE_UP_WEBSITE_AL_IHYA.docx
+++ b/PROPOSAL_SCALE_UP_WEBSITE_AL_IHYA.docx
@@ -2715,7 +2715,7 @@
           <w:sz w:val="22"/>
           <w:szCs w:val="22"/>
         </w:rPr>
-        <w:t xml:space="preserve">Sambutan kepala madrasah, ringkasan profil, program keagamaan unggulan, dan jadwal belajar murid madrasah.</w:t>
+        <w:t xml:space="preserve">Hero banner madrasah diniah, sambutan kepala madrasah, jadwal waktu belajar sore (Senin - Kamis, 15.30 - 17.00 WIB), tombol pintas pendaftaran murid baru, dan informasi tingkatan kelas.</w:t>
       </w:r>
     </w:p>
     <w:p>
@@ -2747,7 +2747,7 @@
           <w:sz w:val="22"/>
           <w:szCs w:val="22"/>
         </w:rPr>
-        <w:t xml:space="preserve">Sejarah madrasah diniah, visi &amp; misi pengajaran keagamaan, serta susunan pengurus dan dewan guru/asatidz.</w:t>
+        <w:t xml:space="preserve">Memuat Profil Madrasah (sejarah pendirian, visi dan misi pengajaran Al-Qur'an sejak usia dini) serta Profil Pengurus (Kepala Madrasah, Dewan Asatidz/Asatidzah pembimbing jilid Iqro, dan bagian tata usaha kesiswaan).</w:t>
       </w:r>
     </w:p>
     <w:p>
@@ -2779,7 +2779,7 @@
           <w:sz w:val="22"/>
           <w:szCs w:val="22"/>
         </w:rPr>
-        <w:t xml:space="preserve">Struktur kurikulum Madrasah Diniyah Takmiliyah, jenjang tingkatan kelas (Iqro, Al-Qur'an, Tajwid, Praktik Ibadah &amp; Doa Harian), dan kalender belajar.</w:t>
+        <w:t xml:space="preserve">Jenjang tingkatan belajar terstruktur (Kelas A: Iqro Jilid 1-3, Kelas B: Iqro Jilid 4-6, Kelas C: Al-Qur'an &amp; Ibadah Praktis), Kurikulum Madrasah Diniyah Takmiliyah (Al-Qur'an &amp; Tajwid, Fiqih Thaharah &amp; Sholat Fardhu, Hafalan Doa Harian &amp; Hadits Adab, Aqidah &amp; Kisah 25 Nabi), serta Jadwal Pembelajaran Sore Santri.</w:t>
       </w:r>
     </w:p>
     <w:p>
@@ -2803,7 +2803,7 @@
           <w:sz w:val="22"/>
           <w:szCs w:val="22"/>
         </w:rPr>
-        <w:t xml:space="preserve">Tata Tertib: </w:t>
+        <w:t xml:space="preserve">Tata Tertib Santri: </w:t>
       </w:r>
       <w:r>
         <w:rPr>
@@ -2811,7 +2811,7 @@
           <w:sz w:val="22"/>
           <w:szCs w:val="22"/>
         </w:rPr>
-        <w:t xml:space="preserve">Tata tertib kehadiran murid madrasah, etika busana muslim/muslimah, dan adab belajar santri diniyah.</w:t>
+        <w:t xml:space="preserve">Ketentuan disiplin kehadiran tepat waktu, etika busana muslim/muslimah (koko &amp; peci / gamis &amp; jilbab), kewajiban membawa mushaf/Iqro &amp; buku mutaba'ah prestasi mandiri, serta pembinaan adab santun.</w:t>
       </w:r>
     </w:p>
     <w:p>
@@ -2835,7 +2835,7 @@
           <w:sz w:val="22"/>
           <w:szCs w:val="22"/>
         </w:rPr>
-        <w:t xml:space="preserve">Galeri: </w:t>
+        <w:t xml:space="preserve">Galeri Dokumentasi: </w:t>
       </w:r>
       <w:r>
         <w:rPr>
@@ -2843,7 +2843,7 @@
           <w:sz w:val="22"/>
           <w:szCs w:val="22"/>
         </w:rPr>
-        <w:t xml:space="preserve">Galeri foto kegiatan belajar mengajar santri, lomba keislaman, pawai santri, serta video kegiatan pentas murid.</w:t>
+        <w:t xml:space="preserve">Galeri Foto kegiatan santri (pawai akbar tahun baru Islam 1 Muharram, lomba mewarnai kaligrafi, bimbingan sorogan membaca) dan Galeri Video YouTube (pentas seni santri cilik, wisuda khotmil qur'an juz 30, dan simulasi manasik haji).</w:t>
       </w:r>
     </w:p>
     <w:p>
@@ -2867,7 +2867,7 @@
           <w:sz w:val="22"/>
           <w:szCs w:val="22"/>
         </w:rPr>
-        <w:t xml:space="preserve">Informasi: </w:t>
+        <w:t xml:space="preserve">Informasi Lembaga: </w:t>
       </w:r>
       <w:r>
         <w:rPr>
@@ -2875,7 +2875,7 @@
           <w:sz w:val="22"/>
           <w:szCs w:val="22"/>
         </w:rPr>
-        <w:t xml:space="preserve">Warta pengumuman madrasah, jadwal evaluasi/ujian kenaikan jilid, dan berita kegiatan.</w:t>
+        <w:t xml:space="preserve">Pengumuman evaluasi kenaikan tingkat jilid santri, jadwal libur dan pesantren kilat ramadhan, serta warta berita kegiatan madrasah.</w:t>
       </w:r>
     </w:p>
     <w:p>
@@ -2907,7 +2907,7 @@
           <w:sz w:val="22"/>
           <w:szCs w:val="22"/>
         </w:rPr>
-        <w:t xml:space="preserve">Alur pendaftaran, persyaratan calon murid, jadwal registrasi, dan rincian biaya pendidikan madrasah.</w:t>
+        <w:t xml:space="preserve">Panduan 4 langkah alur pendaftaran (formulir, berkas, placement test pemetaan jilid, penetapan kelas), berkas persyaratan dokumen (KK, Akta, Pas Foto), jadwal registrasi, dan rincian biaya pendaftaran terjangkau (Rp 100.000,- termasuk buku prestasi &amp; kit modul).</w:t>
       </w:r>
     </w:p>
     <w:p>
@@ -2931,7 +2931,7 @@
           <w:sz w:val="22"/>
           <w:szCs w:val="22"/>
         </w:rPr>
-        <w:t xml:space="preserve">Kontak &amp; Alamat: </w:t>
+        <w:t xml:space="preserve">Kontak &amp; Lokasi: </w:t>
       </w:r>
       <w:r>
         <w:rPr>
@@ -2939,7 +2939,7 @@
           <w:sz w:val="22"/>
           <w:szCs w:val="22"/>
         </w:rPr>
-        <w:t xml:space="preserve">Nomor layanan administrasi madrasah, lokasi ruang kelas, dan peta petunjuk lokasi.</w:t>
+        <w:t xml:space="preserve">Nomor kontak hotline administrasi madrasah (WhatsApp), alamat lengkap ruang kelas madrasah, dan peta Google Maps interaktif.</w:t>
       </w:r>
     </w:p>
     <w:p>
@@ -2963,7 +2963,7 @@
           <w:sz w:val="22"/>
           <w:szCs w:val="22"/>
         </w:rPr>
-        <w:t xml:space="preserve">Tautan Silang (Cross-Links): </w:t>
+        <w:t xml:space="preserve">Fitur Tambahan &amp; Tautan Terpadu: </w:t>
       </w:r>
       <w:r>
         <w:rPr>
@@ -2971,7 +2971,7 @@
           <w:sz w:val="22"/>
           <w:szCs w:val="22"/>
         </w:rPr>
-        <w:t xml:space="preserve">Tautan media sosial madrasah serta tautan silang kembali ke Website Utama, Sub-Website Majelis Taklim (mt.), dan Pondok Pesantren (pp.).</w:t>
+        <w:t xml:space="preserve">Tautan Media Sosial resmi madrasah (Instagram @md.alihyabogor, YouTube, Facebook) serta Tautan Silang (Cross-Links) kembali ke Website Utama (majlisalihyabogor.id), Sub-Website Majelis Taklim (mt.), dan Sub-Website Pondok Pesantren (pp.).</w:t>
       </w:r>
     </w:p>
     <w:p>
@@ -3308,6 +3308,59 @@
           <w:szCs w:val="22"/>
         </w:rPr>
         <w:t xml:space="preserve">Tautan media sosial majelis serta tautan navigasi langsung ke Website Utama, Madrasah Diniah (md.), dan Pondok Pesantren (pp.).</w:t>
+      </w:r>
+    </w:p>
+    <w:p>
+      <w:pPr>
+        <w:jc w:val="left"/>
+        <w:spacing w:before="240" w:after="100" w:line="276" w:lineRule="auto"/>
+      </w:pPr>
+      <w:r>
+        <w:rPr>
+          <w:rFonts w:ascii="Calibri" w:hAnsi="Calibri"/>
+          <w:b/>
+          <w:color w:val="2E5A44"/>
+          <w:sz w:val="25"/>
+          <w:szCs w:val="25"/>
+        </w:rPr>
+        <w:t xml:space="preserve">2.6 Batasan Ruang Lingkup &amp; Integrasi Pihak Ketiga (Out-of-Scope)</w:t>
+      </w:r>
+    </w:p>
+    <w:p>
+      <w:pPr>
+        <w:spacing w:before="120" w:after="120" w:line="276" w:lineRule="auto"/>
+      </w:pPr>
+      <w:r>
+        <w:rPr/>
+        <w:t xml:space="preserve">Untuk menjaga kejelasan batasan tanggung jawab teknis, transparansi pengerjaan, dan efektivitas alokasi investasi, berikut ditegaskan batasan ruang lingkup integrasi sistem pihak ketiga:</w:t>
+      </w:r>
+    </w:p>
+    <w:p>
+      <w:pPr>
+        <w:pBdr>
+          <w:left w:val="single" w:sz="24" w:space="12" w:color="1B4D3E"/>
+        </w:pBdr>
+        <w:shd w:val="clear" w:color="auto" w:fill="F0F6F3"/>
+        <w:spacing w:before="140" w:after="140" w:line="260" w:lineRule="auto"/>
+        <w:ind w:left="240" w:right="240"/>
+      </w:pPr>
+      <w:r>
+        <w:rPr>
+          <w:b/>
+          <w:color w:val="1B4D3E"/>
+          <w:sz w:val="21"/>
+          <w:szCs w:val="21"/>
+        </w:rPr>
+        <w:t xml:space="preserve">CATATAN RUANG LINGKUP INTEGRASI ePESANTREN (APLIKASI PIHAK KETIGA): </w:t>
+      </w:r>
+      <w:r>
+        <w:rPr>
+          <w:i/>
+          <w:color w:val="333333"/>
+          <w:sz w:val="21"/>
+          <w:szCs w:val="21"/>
+        </w:rPr>
+        <w:t xml:space="preserve">Aplikasi Manajemen Santri 'ePesantren' merupakan platform perangkat lunak (SaaS / Mobile Application) terpisah milik vendor penyedia pihak ketiga independen. Ruang lingkup pekerjaan tim MRF-ID dalam project scale-up website ini mencakup penyediaan gerbang akses satu klik (Single-Click Gateway &amp; Redirection) pada website utama dan sub-website pondok pesantren (tombol tautan navigasi bilah navbar, kartu profil integrasi layanan, serta tombol unduh/login aplikasi mobile dan web bagi wali santri &amp; asatidz). Project ini TIDAK mencakup perancangan ulang, coding modul internal, maupun pemeliharaan source code sistem aplikasi ePesantren tersebut.</w:t>
       </w:r>
     </w:p>
     <w:p>

</xml_diff>

<commit_message>
docs: remove 'Opsi A' reference and tidy proposal document
</commit_message>
<xml_diff>
--- a/PROPOSAL_SCALE_UP_WEBSITE_AL_IHYA.docx
+++ b/PROPOSAL_SCALE_UP_WEBSITE_AL_IHYA.docx
@@ -529,6 +529,34 @@
         <w:tabs>
           <w:tab w:val="right" w:leader="dot" w:pos="9360"/>
         </w:tabs>
+        <w:ind w:left="280"/>
+        <w:spacing w:before="40" w:after="40"/>
+      </w:pPr>
+      <w:r>
+        <w:rPr>
+          <w:color w:val="333333"/>
+          <w:sz w:val="20"/>
+          <w:rFonts w:ascii="Calibri" w:hAnsi="Calibri"/>
+        </w:rPr>
+        <w:t xml:space="preserve">2.6 Batasan Ruang Lingkup Sistem Eksternal (Out-of-Scope)</w:t>
+      </w:r>
+      <w:r>
+        <w:tab/>
+      </w:r>
+      <w:r>
+        <w:rPr>
+          <w:color w:val="333333"/>
+          <w:sz w:val="20"/>
+          <w:rFonts w:ascii="Calibri" w:hAnsi="Calibri"/>
+        </w:rPr>
+        <w:t xml:space="preserve">6</w:t>
+      </w:r>
+    </w:p>
+    <w:p>
+      <w:pPr>
+        <w:tabs>
+          <w:tab w:val="right" w:leader="dot" w:pos="9360"/>
+        </w:tabs>
         <w:ind w:left="0"/>
         <w:spacing w:before="100" w:after="60"/>
       </w:pPr>
@@ -953,7 +981,7 @@
       </w:pPr>
       <w:r>
         <w:rPr/>
-        <w:t xml:space="preserve">Proposal ini disusun sebagai solusi menyeluruh atas kebutuhan peningkatan (scale-up) website eksisting Majlis Al-Ihya. Melalui pendekatan arsitektur Multi-Subdomain (Opsi A), setiap unit di bawah naungan yayasan—mulai dari Pondok Pesantren, Madrasah Al-Ihya, hingga Majlis Ta'lim—akan memiliki representasi identitas digital yang mandiri namun tetap berada di bawah kendali satu ekosistem yayasan terpusat.</w:t>
+        <w:t xml:space="preserve">Proposal ini disusun sebagai solusi menyeluruh atas kebutuhan peningkatan (scale-up) website eksisting Majlis Al-Ihya. Melalui pendekatan arsitektur Multi-Subdomain terpadu, setiap unit di bawah naungan yayasan—mulai dari Pondok Pesantren, Madrasah Al-Ihya, hingga Majlis Ta'lim—akan memiliki representasi identitas digital yang mandiri namun tetap berada di bawah kendali satu ekosistem yayasan terpusat.</w:t>
       </w:r>
     </w:p>
     <w:p>

</xml_diff>

<commit_message>
docs: separate each chapter into a new page and sync table of contents with exact pagination
</commit_message>
<xml_diff>
--- a/PROPOSAL_SCALE_UP_WEBSITE_AL_IHYA.docx
+++ b/PROPOSAL_SCALE_UP_WEBSITE_AL_IHYA.docx
@@ -267,7 +267,7 @@
           <w:sz w:val="22"/>
           <w:rFonts w:ascii="Calibri" w:hAnsi="Calibri"/>
         </w:rPr>
-        <w:t xml:space="preserve">3</w:t>
+        <w:t xml:space="preserve">4</w:t>
       </w:r>
     </w:p>
     <w:p>
@@ -295,7 +295,7 @@
           <w:sz w:val="20"/>
           <w:rFonts w:ascii="Calibri" w:hAnsi="Calibri"/>
         </w:rPr>
-        <w:t xml:space="preserve">3</w:t>
+        <w:t xml:space="preserve">4</w:t>
       </w:r>
     </w:p>
     <w:p>
@@ -323,7 +323,7 @@
           <w:sz w:val="20"/>
           <w:rFonts w:ascii="Calibri" w:hAnsi="Calibri"/>
         </w:rPr>
-        <w:t xml:space="preserve">3</w:t>
+        <w:t xml:space="preserve">4</w:t>
       </w:r>
     </w:p>
     <w:p>
@@ -381,7 +381,7 @@
           <w:sz w:val="22"/>
           <w:rFonts w:ascii="Calibri" w:hAnsi="Calibri"/>
         </w:rPr>
-        <w:t xml:space="preserve">4</w:t>
+        <w:t xml:space="preserve">5</w:t>
       </w:r>
     </w:p>
     <w:p>
@@ -409,7 +409,7 @@
           <w:sz w:val="20"/>
           <w:rFonts w:ascii="Calibri" w:hAnsi="Calibri"/>
         </w:rPr>
-        <w:t xml:space="preserve">4</w:t>
+        <w:t xml:space="preserve">5</w:t>
       </w:r>
     </w:p>
     <w:p>
@@ -437,7 +437,7 @@
           <w:sz w:val="20"/>
           <w:rFonts w:ascii="Calibri" w:hAnsi="Calibri"/>
         </w:rPr>
-        <w:t xml:space="preserve">4</w:t>
+        <w:t xml:space="preserve">5</w:t>
       </w:r>
     </w:p>
     <w:p>
@@ -465,7 +465,7 @@
           <w:sz w:val="20"/>
           <w:rFonts w:ascii="Calibri" w:hAnsi="Calibri"/>
         </w:rPr>
-        <w:t xml:space="preserve">5</w:t>
+        <w:t xml:space="preserve">6</w:t>
       </w:r>
     </w:p>
     <w:p>
@@ -493,7 +493,7 @@
           <w:sz w:val="20"/>
           <w:rFonts w:ascii="Calibri" w:hAnsi="Calibri"/>
         </w:rPr>
-        <w:t xml:space="preserve">5</w:t>
+        <w:t xml:space="preserve">6</w:t>
       </w:r>
     </w:p>
     <w:p>
@@ -549,7 +549,7 @@
           <w:sz w:val="20"/>
           <w:rFonts w:ascii="Calibri" w:hAnsi="Calibri"/>
         </w:rPr>
-        <w:t xml:space="preserve">6</w:t>
+        <w:t xml:space="preserve">9</w:t>
       </w:r>
     </w:p>
     <w:p>
@@ -579,7 +579,7 @@
           <w:sz w:val="22"/>
           <w:rFonts w:ascii="Calibri" w:hAnsi="Calibri"/>
         </w:rPr>
-        <w:t xml:space="preserve">7</w:t>
+        <w:t xml:space="preserve">10</w:t>
       </w:r>
     </w:p>
     <w:p>
@@ -607,7 +607,7 @@
           <w:sz w:val="20"/>
           <w:rFonts w:ascii="Calibri" w:hAnsi="Calibri"/>
         </w:rPr>
-        <w:t xml:space="preserve">7</w:t>
+        <w:t xml:space="preserve">10</w:t>
       </w:r>
     </w:p>
     <w:p>
@@ -635,7 +635,7 @@
           <w:sz w:val="20"/>
           <w:rFonts w:ascii="Calibri" w:hAnsi="Calibri"/>
         </w:rPr>
-        <w:t xml:space="preserve">7</w:t>
+        <w:t xml:space="preserve">10</w:t>
       </w:r>
     </w:p>
     <w:p>
@@ -665,7 +665,7 @@
           <w:sz w:val="22"/>
           <w:rFonts w:ascii="Calibri" w:hAnsi="Calibri"/>
         </w:rPr>
-        <w:t xml:space="preserve">8</w:t>
+        <w:t xml:space="preserve">11</w:t>
       </w:r>
     </w:p>
     <w:p>
@@ -693,7 +693,7 @@
           <w:sz w:val="20"/>
           <w:rFonts w:ascii="Calibri" w:hAnsi="Calibri"/>
         </w:rPr>
-        <w:t xml:space="preserve">8</w:t>
+        <w:t xml:space="preserve">11</w:t>
       </w:r>
     </w:p>
     <w:p>
@@ -721,7 +721,7 @@
           <w:sz w:val="20"/>
           <w:rFonts w:ascii="Calibri" w:hAnsi="Calibri"/>
         </w:rPr>
-        <w:t xml:space="preserve">8</w:t>
+        <w:t xml:space="preserve">12</w:t>
       </w:r>
     </w:p>
     <w:p>
@@ -749,7 +749,7 @@
           <w:sz w:val="20"/>
           <w:rFonts w:ascii="Calibri" w:hAnsi="Calibri"/>
         </w:rPr>
-        <w:t xml:space="preserve">9</w:t>
+        <w:t xml:space="preserve">12</w:t>
       </w:r>
     </w:p>
     <w:p>
@@ -777,7 +777,7 @@
           <w:sz w:val="20"/>
           <w:rFonts w:ascii="Calibri" w:hAnsi="Calibri"/>
         </w:rPr>
-        <w:t xml:space="preserve">9</w:t>
+        <w:t xml:space="preserve">12</w:t>
       </w:r>
     </w:p>
     <w:p>
@@ -807,7 +807,7 @@
           <w:sz w:val="22"/>
           <w:rFonts w:ascii="Calibri" w:hAnsi="Calibri"/>
         </w:rPr>
-        <w:t xml:space="preserve">9</w:t>
+        <w:t xml:space="preserve">13</w:t>
       </w:r>
     </w:p>
     <w:p>
@@ -837,7 +837,7 @@
           <w:sz w:val="22"/>
           <w:rFonts w:ascii="Calibri" w:hAnsi="Calibri"/>
         </w:rPr>
-        <w:t xml:space="preserve">9</w:t>
+        <w:t xml:space="preserve">14</w:t>
       </w:r>
     </w:p>
     <w:p>
@@ -865,7 +865,7 @@
           <w:sz w:val="20"/>
           <w:rFonts w:ascii="Calibri" w:hAnsi="Calibri"/>
         </w:rPr>
-        <w:t xml:space="preserve">9</w:t>
+        <w:t xml:space="preserve">14</w:t>
       </w:r>
     </w:p>
     <w:p>
@@ -893,7 +893,7 @@
           <w:sz w:val="20"/>
           <w:rFonts w:ascii="Calibri" w:hAnsi="Calibri"/>
         </w:rPr>
-        <w:t xml:space="preserve">10</w:t>
+        <w:t xml:space="preserve">14</w:t>
       </w:r>
     </w:p>
     <w:p>
@@ -923,7 +923,7 @@
           <w:sz w:val="22"/>
           <w:rFonts w:ascii="Calibri" w:hAnsi="Calibri"/>
         </w:rPr>
-        <w:t xml:space="preserve">10</w:t>
+        <w:t xml:space="preserve">15</w:t>
       </w:r>
     </w:p>
     <w:p>
@@ -1081,6 +1081,11 @@
       </w:r>
     </w:p>
     <w:p>
+      <w:r>
+        <w:br w:type="page"/>
+      </w:r>
+    </w:p>
+    <w:p>
       <w:pPr>
         <w:jc w:val="left"/>
         <w:spacing w:before="360" w:after="140" w:line="276" w:lineRule="auto"/>
@@ -1297,6 +1302,11 @@
       <w:r>
         <w:rPr/>
         <w:t xml:space="preserve">Dengan diterapkannya sistem baru ini, Majlis Al-Ihya Bogor akan memiliki arsip digital kegiatan yang rapi, kemudahan dalam penyebaran warta kajian dan kegiatan santri, serta proses seleksi santri baru yang terdokumentasi rapi dalam basis data digital yang aman.</w:t>
+      </w:r>
+    </w:p>
+    <w:p>
+      <w:r>
+        <w:br w:type="page"/>
       </w:r>
     </w:p>
     <w:p>
@@ -1694,7 +1704,7 @@
     </w:tbl>
     <w:p>
       <w:pPr>
-        <w:spacing w:before="100" w:after="100" w:line="276" w:lineRule="auto"/>
+        <w:spacing w:before="80" w:after="80" w:line="276" w:lineRule="auto"/>
       </w:pPr>
     </w:p>
     <w:p>
@@ -3336,6 +3346,11 @@
           <w:szCs w:val="22"/>
         </w:rPr>
         <w:t xml:space="preserve">Tautan media sosial majelis serta tautan navigasi langsung ke Website Utama, Madrasah Diniah (md.), dan Pondok Pesantren (pp.).</w:t>
+      </w:r>
+    </w:p>
+    <w:p>
+      <w:r>
+        <w:br w:type="page"/>
       </w:r>
     </w:p>
     <w:p>
@@ -3414,11 +3429,43 @@
     </w:p>
     <w:p>
       <w:pPr>
+        <w:jc w:val="left"/>
+        <w:spacing w:before="240" w:after="100" w:line="276" w:lineRule="auto"/>
+      </w:pPr>
+      <w:r>
+        <w:rPr>
+          <w:rFonts w:ascii="Calibri" w:hAnsi="Calibri"/>
+          <w:b/>
+          <w:color w:val="2E5A44"/>
+          <w:sz w:val="25"/>
+          <w:szCs w:val="25"/>
+        </w:rPr>
+        <w:t xml:space="preserve">3.1 Pendekatan Kerja Bertahap (Agile Sprints)</w:t>
+      </w:r>
+    </w:p>
+    <w:p>
+      <w:pPr>
         <w:spacing w:before="120" w:after="120" w:line="276" w:lineRule="auto"/>
       </w:pPr>
       <w:r>
         <w:rPr/>
         <w:t xml:space="preserve">Pengembangan dilakukan dengan pendekatan bertahap (Agile Sprints) selama rentang waktu 6 (enam) minggu. Setiap akhir tahapan disertai pelaporan progres sehingga pihak yayasan dapat memantau perkembangan secara transparan.</w:t>
+      </w:r>
+    </w:p>
+    <w:p>
+      <w:pPr>
+        <w:jc w:val="left"/>
+        <w:spacing w:before="240" w:after="100" w:line="276" w:lineRule="auto"/>
+      </w:pPr>
+      <w:r>
+        <w:rPr>
+          <w:rFonts w:ascii="Calibri" w:hAnsi="Calibri"/>
+          <w:b/>
+          <w:color w:val="2E5A44"/>
+          <w:sz w:val="25"/>
+          <w:szCs w:val="25"/>
+        </w:rPr>
+        <w:t xml:space="preserve">3.2 Tabel Rencana Waktu Pengerjaan 6 Minggu</w:t>
       </w:r>
     </w:p>
     <w:tbl>
@@ -3907,8 +3954,13 @@
     </w:tbl>
     <w:p>
       <w:pPr>
-        <w:spacing w:before="100" w:after="100" w:line="276" w:lineRule="auto"/>
-      </w:pPr>
+        <w:spacing w:before="80" w:after="80" w:line="276" w:lineRule="auto"/>
+      </w:pPr>
+    </w:p>
+    <w:p>
+      <w:r>
+        <w:br w:type="page"/>
+      </w:r>
     </w:p>
     <w:p>
       <w:pPr>
@@ -4251,7 +4303,7 @@
     </w:tbl>
     <w:p>
       <w:pPr>
-        <w:spacing w:before="100" w:after="100" w:line="276" w:lineRule="auto"/>
+        <w:spacing w:before="80" w:after="80" w:line="276" w:lineRule="auto"/>
       </w:pPr>
     </w:p>
     <w:p>
@@ -4283,9 +4335,14 @@
       </w:r>
     </w:p>
     <w:p>
+      <w:r>
+        <w:br w:type="page"/>
+      </w:r>
+    </w:p>
+    <w:p>
       <w:pPr>
         <w:jc w:val="left"/>
-        <w:spacing w:before="240" w:after="100" w:line="276" w:lineRule="auto"/>
+        <w:spacing w:before="140" w:after="60" w:line="276" w:lineRule="auto"/>
       </w:pPr>
       <w:r>
         <w:rPr>
@@ -4305,6 +4362,1096 @@
       <w:r>
         <w:rPr/>
         <w:t xml:space="preserve">Rincian nilai alokasi pekerjaan berdasarkan struktur estimasi pengembangan normal:</w:t>
+      </w:r>
+    </w:p>
+    <w:tbl>
+      <w:tblPr>
+        <w:tblW w:w="9500" w:type="dxa"/>
+        <w:jc w:val="center"/>
+        <w:tblBorders>
+          <w:top w:val="single" w:sz="6" w:space="0" w:color="D0D7DE"/>
+          <w:left w:val="none"/>
+          <w:bottom w:val="single" w:sz="8" w:space="0" w:color="1B4D3E"/>
+          <w:right w:val="none"/>
+          <w:insideH w:val="single" w:sz="4" w:space="0" w:color="E1E4E8"/>
+          <w:insideV w:val="none"/>
+        </w:tblBorders>
+        <w:tblCellMar>
+          <w:top w:w="60" w:type="dxa"/>
+          <w:left w:w="140" w:type="dxa"/>
+          <w:bottom w:w="60" w:type="dxa"/>
+          <w:right w:w="140" w:type="dxa"/>
+        </w:tblCellMar>
+      </w:tblPr>
+      <w:tr>
+        <w:trPr>
+          <w:tblHeader/>
+        </w:trPr>
+        <w:tc>
+          <w:tcPr>
+            <w:tcW w:w="600" w:type="dxa"/>
+            <w:shd w:val="clear" w:color="auto" w:fill="1B4D3E"/>
+          </w:tcPr>
+          <w:p>
+            <w:pPr>
+              <w:jc w:val="left"/>
+              <w:spacing w:before="40" w:after="40"/>
+            </w:pPr>
+            <w:r>
+              <w:rPr>
+                <w:b/>
+                <w:color w:val="FFFFFF"/>
+                <w:sz w:val="21"/>
+                <w:rFonts w:ascii="Calibri" w:hAnsi="Calibri"/>
+              </w:rPr>
+              <w:t xml:space="preserve">No</w:t>
+            </w:r>
+          </w:p>
+        </w:tc>
+        <w:tc>
+          <w:tcPr>
+            <w:tcW w:w="3200" w:type="dxa"/>
+            <w:shd w:val="clear" w:color="auto" w:fill="1B4D3E"/>
+          </w:tcPr>
+          <w:p>
+            <w:pPr>
+              <w:jc w:val="left"/>
+              <w:spacing w:before="40" w:after="40"/>
+            </w:pPr>
+            <w:r>
+              <w:rPr>
+                <w:b/>
+                <w:color w:val="FFFFFF"/>
+                <w:sz w:val="21"/>
+                <w:rFonts w:ascii="Calibri" w:hAnsi="Calibri"/>
+              </w:rPr>
+              <w:t xml:space="preserve">Komponen Pekerjaan</w:t>
+            </w:r>
+          </w:p>
+        </w:tc>
+        <w:tc>
+          <w:tcPr>
+            <w:tcW w:w="3900" w:type="dxa"/>
+            <w:shd w:val="clear" w:color="auto" w:fill="1B4D3E"/>
+          </w:tcPr>
+          <w:p>
+            <w:pPr>
+              <w:jc w:val="left"/>
+              <w:spacing w:before="40" w:after="40"/>
+            </w:pPr>
+            <w:r>
+              <w:rPr>
+                <w:b/>
+                <w:color w:val="FFFFFF"/>
+                <w:sz w:val="21"/>
+                <w:rFonts w:ascii="Calibri" w:hAnsi="Calibri"/>
+              </w:rPr>
+              <w:t xml:space="preserve">Uraian Teknis &amp; Deliverables</w:t>
+            </w:r>
+          </w:p>
+        </w:tc>
+        <w:tc>
+          <w:tcPr>
+            <w:tcW w:w="1800" w:type="dxa"/>
+            <w:shd w:val="clear" w:color="auto" w:fill="1B4D3E"/>
+          </w:tcPr>
+          <w:p>
+            <w:pPr>
+              <w:jc w:val="left"/>
+              <w:spacing w:before="40" w:after="40"/>
+            </w:pPr>
+            <w:r>
+              <w:rPr>
+                <w:b/>
+                <w:color w:val="FFFFFF"/>
+                <w:sz w:val="21"/>
+                <w:rFonts w:ascii="Calibri" w:hAnsi="Calibri"/>
+              </w:rPr>
+              <w:t xml:space="preserve">Alokasi Nilai</w:t>
+            </w:r>
+          </w:p>
+        </w:tc>
+      </w:tr>
+      <w:tr>
+        <w:tc>
+          <w:tcPr>
+            <w:tcW w:w="600" w:type="dxa"/>
+            <w:shd w:val="clear" w:color="auto" w:fill="FFFFFF"/>
+          </w:tcPr>
+          <w:p>
+            <w:pPr>
+              <w:jc w:val="left"/>
+              <w:spacing w:before="30" w:after="30" w:line="240" w:lineRule="auto"/>
+              <w:ind w:left="40" w:right="40"/>
+            </w:pPr>
+            <w:r>
+              <w:rPr>
+                <w:color w:val="333333"/>
+                <w:sz w:val="20"/>
+                <w:rFonts w:ascii="Calibri" w:hAnsi="Calibri"/>
+              </w:rPr>
+              <w:t xml:space="preserve">1</w:t>
+            </w:r>
+          </w:p>
+        </w:tc>
+        <w:tc>
+          <w:tcPr>
+            <w:tcW w:w="3200" w:type="dxa"/>
+            <w:shd w:val="clear" w:color="auto" w:fill="FFFFFF"/>
+          </w:tcPr>
+          <w:p>
+            <w:pPr>
+              <w:jc w:val="left"/>
+              <w:spacing w:before="30" w:after="30" w:line="240" w:lineRule="auto"/>
+              <w:ind w:left="40" w:right="40"/>
+            </w:pPr>
+            <w:r>
+              <w:rPr>
+                <w:b/>
+                <w:color w:val="333333"/>
+                <w:sz w:val="20"/>
+                <w:rFonts w:ascii="Calibri" w:hAnsi="Calibri"/>
+              </w:rPr>
+              <w:t xml:space="preserve">Arsitektur Multi-Subdomain &amp; Core Engine</w:t>
+            </w:r>
+          </w:p>
+        </w:tc>
+        <w:tc>
+          <w:tcPr>
+            <w:tcW w:w="3900" w:type="dxa"/>
+            <w:shd w:val="clear" w:color="auto" w:fill="FFFFFF"/>
+          </w:tcPr>
+          <w:p>
+            <w:pPr>
+              <w:jc w:val="left"/>
+              <w:spacing w:before="30" w:after="30" w:line="240" w:lineRule="auto"/>
+              <w:ind w:left="40" w:right="40"/>
+            </w:pPr>
+            <w:r>
+              <w:rPr>
+                <w:color w:val="333333"/>
+                <w:sz w:val="20"/>
+                <w:rFonts w:ascii="Calibri" w:hAnsi="Calibri"/>
+              </w:rPr>
+              <w:t xml:space="preserve">Setup DNS wildcard, subdomain routing (pp, md, mt), multi-tenant middleware, struktur database terpadu</w:t>
+            </w:r>
+          </w:p>
+        </w:tc>
+        <w:tc>
+          <w:tcPr>
+            <w:tcW w:w="1800" w:type="dxa"/>
+            <w:shd w:val="clear" w:color="auto" w:fill="FFFFFF"/>
+          </w:tcPr>
+          <w:p>
+            <w:pPr>
+              <w:jc w:val="left"/>
+              <w:spacing w:before="30" w:after="30" w:line="240" w:lineRule="auto"/>
+              <w:ind w:left="40" w:right="40"/>
+            </w:pPr>
+            <w:r>
+              <w:rPr>
+                <w:color w:val="333333"/>
+                <w:sz w:val="20"/>
+                <w:rFonts w:ascii="Calibri" w:hAnsi="Calibri"/>
+              </w:rPr>
+              <w:t xml:space="preserve">Rp 2.500.000</w:t>
+            </w:r>
+          </w:p>
+        </w:tc>
+      </w:tr>
+      <w:tr>
+        <w:tc>
+          <w:tcPr>
+            <w:tcW w:w="600" w:type="dxa"/>
+            <w:shd w:val="clear" w:color="auto" w:fill="F9FBFA"/>
+          </w:tcPr>
+          <w:p>
+            <w:pPr>
+              <w:jc w:val="left"/>
+              <w:spacing w:before="30" w:after="30" w:line="240" w:lineRule="auto"/>
+              <w:ind w:left="40" w:right="40"/>
+            </w:pPr>
+            <w:r>
+              <w:rPr>
+                <w:color w:val="333333"/>
+                <w:sz w:val="20"/>
+                <w:rFonts w:ascii="Calibri" w:hAnsi="Calibri"/>
+              </w:rPr>
+              <w:t xml:space="preserve">2</w:t>
+            </w:r>
+          </w:p>
+        </w:tc>
+        <w:tc>
+          <w:tcPr>
+            <w:tcW w:w="3200" w:type="dxa"/>
+            <w:shd w:val="clear" w:color="auto" w:fill="F9FBFA"/>
+          </w:tcPr>
+          <w:p>
+            <w:pPr>
+              <w:jc w:val="left"/>
+              <w:spacing w:before="30" w:after="30" w:line="240" w:lineRule="auto"/>
+              <w:ind w:left="40" w:right="40"/>
+            </w:pPr>
+            <w:r>
+              <w:rPr>
+                <w:b/>
+                <w:color w:val="333333"/>
+                <w:sz w:val="20"/>
+                <w:rFonts w:ascii="Calibri" w:hAnsi="Calibri"/>
+              </w:rPr>
+              <w:t xml:space="preserve">UI/UX &amp; Front-End 4 Portal Web</w:t>
+            </w:r>
+          </w:p>
+        </w:tc>
+        <w:tc>
+          <w:tcPr>
+            <w:tcW w:w="3900" w:type="dxa"/>
+            <w:shd w:val="clear" w:color="auto" w:fill="F9FBFA"/>
+          </w:tcPr>
+          <w:p>
+            <w:pPr>
+              <w:jc w:val="left"/>
+              <w:spacing w:before="30" w:after="30" w:line="240" w:lineRule="auto"/>
+              <w:ind w:left="40" w:right="40"/>
+            </w:pPr>
+            <w:r>
+              <w:rPr>
+                <w:color w:val="333333"/>
+                <w:sz w:val="20"/>
+                <w:rFonts w:ascii="Calibri" w:hAnsi="Calibri"/>
+              </w:rPr>
+              <w:t xml:space="preserve">Desain responsif mobile Portal Utama, Ponpes Al-Ihya, Madrasah Diniah, dan Majelis Taklim (termasuk Jadwal Sholat &amp; Live Stream)</w:t>
+            </w:r>
+          </w:p>
+        </w:tc>
+        <w:tc>
+          <w:tcPr>
+            <w:tcW w:w="1800" w:type="dxa"/>
+            <w:shd w:val="clear" w:color="auto" w:fill="F9FBFA"/>
+          </w:tcPr>
+          <w:p>
+            <w:pPr>
+              <w:jc w:val="left"/>
+              <w:spacing w:before="30" w:after="30" w:line="240" w:lineRule="auto"/>
+              <w:ind w:left="40" w:right="40"/>
+            </w:pPr>
+            <w:r>
+              <w:rPr>
+                <w:color w:val="333333"/>
+                <w:sz w:val="20"/>
+                <w:rFonts w:ascii="Calibri" w:hAnsi="Calibri"/>
+              </w:rPr>
+              <w:t xml:space="preserve">Rp 4.500.000</w:t>
+            </w:r>
+          </w:p>
+        </w:tc>
+      </w:tr>
+      <w:tr>
+        <w:tc>
+          <w:tcPr>
+            <w:tcW w:w="600" w:type="dxa"/>
+            <w:shd w:val="clear" w:color="auto" w:fill="FFFFFF"/>
+          </w:tcPr>
+          <w:p>
+            <w:pPr>
+              <w:jc w:val="left"/>
+              <w:spacing w:before="30" w:after="30" w:line="240" w:lineRule="auto"/>
+              <w:ind w:left="40" w:right="40"/>
+            </w:pPr>
+            <w:r>
+              <w:rPr>
+                <w:color w:val="333333"/>
+                <w:sz w:val="20"/>
+                <w:rFonts w:ascii="Calibri" w:hAnsi="Calibri"/>
+              </w:rPr>
+              <w:t xml:space="preserve">3</w:t>
+            </w:r>
+          </w:p>
+        </w:tc>
+        <w:tc>
+          <w:tcPr>
+            <w:tcW w:w="3200" w:type="dxa"/>
+            <w:shd w:val="clear" w:color="auto" w:fill="FFFFFF"/>
+          </w:tcPr>
+          <w:p>
+            <w:pPr>
+              <w:jc w:val="left"/>
+              <w:spacing w:before="30" w:after="30" w:line="240" w:lineRule="auto"/>
+              <w:ind w:left="40" w:right="40"/>
+            </w:pPr>
+            <w:r>
+              <w:rPr>
+                <w:b/>
+                <w:color w:val="333333"/>
+                <w:sz w:val="20"/>
+                <w:rFonts w:ascii="Calibri" w:hAnsi="Calibri"/>
+              </w:rPr>
+              <w:t xml:space="preserve">CMS Back-Office Terpadu &amp; Multi-Role</w:t>
+            </w:r>
+          </w:p>
+        </w:tc>
+        <w:tc>
+          <w:tcPr>
+            <w:tcW w:w="3900" w:type="dxa"/>
+            <w:shd w:val="clear" w:color="auto" w:fill="FFFFFF"/>
+          </w:tcPr>
+          <w:p>
+            <w:pPr>
+              <w:jc w:val="left"/>
+              <w:spacing w:before="30" w:after="30" w:line="240" w:lineRule="auto"/>
+              <w:ind w:left="40" w:right="40"/>
+            </w:pPr>
+            <w:r>
+              <w:rPr>
+                <w:color w:val="333333"/>
+                <w:sz w:val="20"/>
+                <w:rFonts w:ascii="Calibri" w:hAnsi="Calibri"/>
+              </w:rPr>
+              <w:t xml:space="preserve">Dashboard admin terisolasi untuk berita, galeri foto/video, agenda kajian, tata tertib, dan media manager</w:t>
+            </w:r>
+          </w:p>
+        </w:tc>
+        <w:tc>
+          <w:tcPr>
+            <w:tcW w:w="1800" w:type="dxa"/>
+            <w:shd w:val="clear" w:color="auto" w:fill="FFFFFF"/>
+          </w:tcPr>
+          <w:p>
+            <w:pPr>
+              <w:jc w:val="left"/>
+              <w:spacing w:before="30" w:after="30" w:line="240" w:lineRule="auto"/>
+              <w:ind w:left="40" w:right="40"/>
+            </w:pPr>
+            <w:r>
+              <w:rPr>
+                <w:color w:val="333333"/>
+                <w:sz w:val="20"/>
+                <w:rFonts w:ascii="Calibri" w:hAnsi="Calibri"/>
+              </w:rPr>
+              <w:t xml:space="preserve">Rp 3.500.000</w:t>
+            </w:r>
+          </w:p>
+        </w:tc>
+      </w:tr>
+      <w:tr>
+        <w:tc>
+          <w:tcPr>
+            <w:tcW w:w="600" w:type="dxa"/>
+            <w:shd w:val="clear" w:color="auto" w:fill="F9FBFA"/>
+          </w:tcPr>
+          <w:p>
+            <w:pPr>
+              <w:jc w:val="left"/>
+              <w:spacing w:before="30" w:after="30" w:line="240" w:lineRule="auto"/>
+              <w:ind w:left="40" w:right="40"/>
+            </w:pPr>
+            <w:r>
+              <w:rPr>
+                <w:color w:val="333333"/>
+                <w:sz w:val="20"/>
+                <w:rFonts w:ascii="Calibri" w:hAnsi="Calibri"/>
+              </w:rPr>
+              <w:t xml:space="preserve">4</w:t>
+            </w:r>
+          </w:p>
+        </w:tc>
+        <w:tc>
+          <w:tcPr>
+            <w:tcW w:w="3200" w:type="dxa"/>
+            <w:shd w:val="clear" w:color="auto" w:fill="F9FBFA"/>
+          </w:tcPr>
+          <w:p>
+            <w:pPr>
+              <w:jc w:val="left"/>
+              <w:spacing w:before="30" w:after="30" w:line="240" w:lineRule="auto"/>
+              <w:ind w:left="40" w:right="40"/>
+            </w:pPr>
+            <w:r>
+              <w:rPr>
+                <w:b/>
+                <w:color w:val="333333"/>
+                <w:sz w:val="20"/>
+                <w:rFonts w:ascii="Calibri" w:hAnsi="Calibri"/>
+              </w:rPr>
+              <w:t xml:space="preserve">Modul Portal PPDB Online Terpadu</w:t>
+            </w:r>
+          </w:p>
+        </w:tc>
+        <w:tc>
+          <w:tcPr>
+            <w:tcW w:w="3900" w:type="dxa"/>
+            <w:shd w:val="clear" w:color="auto" w:fill="F9FBFA"/>
+          </w:tcPr>
+          <w:p>
+            <w:pPr>
+              <w:jc w:val="left"/>
+              <w:spacing w:before="30" w:after="30" w:line="240" w:lineRule="auto"/>
+              <w:ind w:left="40" w:right="40"/>
+            </w:pPr>
+            <w:r>
+              <w:rPr>
+                <w:color w:val="333333"/>
+                <w:sz w:val="20"/>
+                <w:rFonts w:ascii="Calibri" w:hAnsi="Calibri"/>
+              </w:rPr>
+              <w:t xml:space="preserve">Form wizard pendaftaran, upload berkas KK/Akta/Foto, cek status mandiri, kartu PDF, export data Excel</w:t>
+            </w:r>
+          </w:p>
+        </w:tc>
+        <w:tc>
+          <w:tcPr>
+            <w:tcW w:w="1800" w:type="dxa"/>
+            <w:shd w:val="clear" w:color="auto" w:fill="F9FBFA"/>
+          </w:tcPr>
+          <w:p>
+            <w:pPr>
+              <w:jc w:val="left"/>
+              <w:spacing w:before="30" w:after="30" w:line="240" w:lineRule="auto"/>
+              <w:ind w:left="40" w:right="40"/>
+            </w:pPr>
+            <w:r>
+              <w:rPr>
+                <w:color w:val="333333"/>
+                <w:sz w:val="20"/>
+                <w:rFonts w:ascii="Calibri" w:hAnsi="Calibri"/>
+              </w:rPr>
+              <w:t xml:space="preserve">Rp 3.500.000</w:t>
+            </w:r>
+          </w:p>
+        </w:tc>
+      </w:tr>
+      <w:tr>
+        <w:tc>
+          <w:tcPr>
+            <w:tcW w:w="600" w:type="dxa"/>
+            <w:shd w:val="clear" w:color="auto" w:fill="FFFFFF"/>
+          </w:tcPr>
+          <w:p>
+            <w:pPr>
+              <w:jc w:val="left"/>
+              <w:spacing w:before="30" w:after="30" w:line="240" w:lineRule="auto"/>
+              <w:ind w:left="40" w:right="40"/>
+            </w:pPr>
+            <w:r>
+              <w:rPr>
+                <w:color w:val="333333"/>
+                <w:sz w:val="20"/>
+                <w:rFonts w:ascii="Calibri" w:hAnsi="Calibri"/>
+              </w:rPr>
+              <w:t xml:space="preserve">5</w:t>
+            </w:r>
+          </w:p>
+        </w:tc>
+        <w:tc>
+          <w:tcPr>
+            <w:tcW w:w="3200" w:type="dxa"/>
+            <w:shd w:val="clear" w:color="auto" w:fill="FFFFFF"/>
+          </w:tcPr>
+          <w:p>
+            <w:pPr>
+              <w:jc w:val="left"/>
+              <w:spacing w:before="30" w:after="30" w:line="240" w:lineRule="auto"/>
+              <w:ind w:left="40" w:right="40"/>
+            </w:pPr>
+            <w:r>
+              <w:rPr>
+                <w:b/>
+                <w:color w:val="333333"/>
+                <w:sz w:val="20"/>
+                <w:rFonts w:ascii="Calibri" w:hAnsi="Calibri"/>
+              </w:rPr>
+              <w:t xml:space="preserve">Testing, Training &amp; Manual Guide PDF</w:t>
+            </w:r>
+          </w:p>
+        </w:tc>
+        <w:tc>
+          <w:tcPr>
+            <w:tcW w:w="3900" w:type="dxa"/>
+            <w:shd w:val="clear" w:color="auto" w:fill="FFFFFF"/>
+          </w:tcPr>
+          <w:p>
+            <w:pPr>
+              <w:jc w:val="left"/>
+              <w:spacing w:before="30" w:after="30" w:line="240" w:lineRule="auto"/>
+              <w:ind w:left="40" w:right="40"/>
+            </w:pPr>
+            <w:r>
+              <w:rPr>
+                <w:color w:val="333333"/>
+                <w:sz w:val="20"/>
+                <w:rFonts w:ascii="Calibri" w:hAnsi="Calibri"/>
+              </w:rPr>
+              <w:t xml:space="preserve">Uji coba keamanan sistem, pelatihan intensif operator/panitia PPDB, penyusunan buku panduan penggunaan</w:t>
+            </w:r>
+          </w:p>
+        </w:tc>
+        <w:tc>
+          <w:tcPr>
+            <w:tcW w:w="1800" w:type="dxa"/>
+            <w:shd w:val="clear" w:color="auto" w:fill="FFFFFF"/>
+          </w:tcPr>
+          <w:p>
+            <w:pPr>
+              <w:jc w:val="left"/>
+              <w:spacing w:before="30" w:after="30" w:line="240" w:lineRule="auto"/>
+              <w:ind w:left="40" w:right="40"/>
+            </w:pPr>
+            <w:r>
+              <w:rPr>
+                <w:color w:val="333333"/>
+                <w:sz w:val="20"/>
+                <w:rFonts w:ascii="Calibri" w:hAnsi="Calibri"/>
+              </w:rPr>
+              <w:t xml:space="preserve">Rp 1.000.000</w:t>
+            </w:r>
+          </w:p>
+        </w:tc>
+      </w:tr>
+      <w:tr>
+        <w:tc>
+          <w:tcPr>
+            <w:tcW w:w="600" w:type="dxa"/>
+            <w:shd w:val="clear" w:color="auto" w:fill="F9FBFA"/>
+          </w:tcPr>
+          <w:p>
+            <w:pPr>
+              <w:jc w:val="left"/>
+              <w:spacing w:before="30" w:after="30" w:line="240" w:lineRule="auto"/>
+              <w:ind w:left="40" w:right="40"/>
+            </w:pPr>
+            <w:r>
+              <w:rPr>
+                <w:color w:val="333333"/>
+                <w:sz w:val="20"/>
+                <w:rFonts w:ascii="Calibri" w:hAnsi="Calibri"/>
+              </w:rPr>
+              <w:t xml:space="preserve"/>
+            </w:r>
+          </w:p>
+        </w:tc>
+        <w:tc>
+          <w:tcPr>
+            <w:tcW w:w="3200" w:type="dxa"/>
+            <w:shd w:val="clear" w:color="auto" w:fill="F9FBFA"/>
+          </w:tcPr>
+          <w:p>
+            <w:pPr>
+              <w:jc w:val="left"/>
+              <w:spacing w:before="30" w:after="30" w:line="240" w:lineRule="auto"/>
+              <w:ind w:left="40" w:right="40"/>
+            </w:pPr>
+            <w:r>
+              <w:rPr>
+                <w:b/>
+                <w:color w:val="333333"/>
+                <w:sz w:val="20"/>
+                <w:rFonts w:ascii="Calibri" w:hAnsi="Calibri"/>
+              </w:rPr>
+              <w:t xml:space="preserve">Total Nilai Standar Pekerjaan</w:t>
+            </w:r>
+          </w:p>
+        </w:tc>
+        <w:tc>
+          <w:tcPr>
+            <w:tcW w:w="3900" w:type="dxa"/>
+            <w:shd w:val="clear" w:color="auto" w:fill="F9FBFA"/>
+          </w:tcPr>
+          <w:p>
+            <w:pPr>
+              <w:jc w:val="left"/>
+              <w:spacing w:before="30" w:after="30" w:line="240" w:lineRule="auto"/>
+              <w:ind w:left="40" w:right="40"/>
+            </w:pPr>
+            <w:r>
+              <w:rPr>
+                <w:color w:val="333333"/>
+                <w:sz w:val="20"/>
+                <w:rFonts w:ascii="Calibri" w:hAnsi="Calibri"/>
+              </w:rPr>
+              <w:t xml:space="preserve"/>
+            </w:r>
+          </w:p>
+        </w:tc>
+        <w:tc>
+          <w:tcPr>
+            <w:tcW w:w="1800" w:type="dxa"/>
+            <w:shd w:val="clear" w:color="auto" w:fill="F9FBFA"/>
+          </w:tcPr>
+          <w:p>
+            <w:pPr>
+              <w:jc w:val="left"/>
+              <w:spacing w:before="30" w:after="30" w:line="240" w:lineRule="auto"/>
+              <w:ind w:left="40" w:right="40"/>
+            </w:pPr>
+            <w:r>
+              <w:rPr>
+                <w:b/>
+                <w:color w:val="333333"/>
+                <w:sz w:val="20"/>
+                <w:rFonts w:ascii="Calibri" w:hAnsi="Calibri"/>
+              </w:rPr>
+              <w:t xml:space="preserve">Rp 15.000.000,-</w:t>
+            </w:r>
+          </w:p>
+        </w:tc>
+      </w:tr>
+      <w:tr>
+        <w:tc>
+          <w:tcPr>
+            <w:tcW w:w="600" w:type="dxa"/>
+            <w:shd w:val="clear" w:color="auto" w:fill="FFFFFF"/>
+          </w:tcPr>
+          <w:p>
+            <w:pPr>
+              <w:jc w:val="left"/>
+              <w:spacing w:before="30" w:after="30" w:line="240" w:lineRule="auto"/>
+              <w:ind w:left="40" w:right="40"/>
+            </w:pPr>
+            <w:r>
+              <w:rPr>
+                <w:color w:val="333333"/>
+                <w:sz w:val="20"/>
+                <w:rFonts w:ascii="Calibri" w:hAnsi="Calibri"/>
+              </w:rPr>
+              <w:t xml:space="preserve"/>
+            </w:r>
+          </w:p>
+        </w:tc>
+        <w:tc>
+          <w:tcPr>
+            <w:tcW w:w="3200" w:type="dxa"/>
+            <w:shd w:val="clear" w:color="auto" w:fill="FFFFFF"/>
+          </w:tcPr>
+          <w:p>
+            <w:pPr>
+              <w:jc w:val="left"/>
+              <w:spacing w:before="30" w:after="30" w:line="240" w:lineRule="auto"/>
+              <w:ind w:left="40" w:right="40"/>
+            </w:pPr>
+            <w:r>
+              <w:rPr>
+                <w:b/>
+                <w:color w:val="1B4D3E"/>
+                <w:sz w:val="20"/>
+                <w:rFonts w:ascii="Calibri" w:hAnsi="Calibri"/>
+              </w:rPr>
+              <w:t xml:space="preserve">Subsidi Apresiasi Kemitraan Digital</w:t>
+            </w:r>
+          </w:p>
+        </w:tc>
+        <w:tc>
+          <w:tcPr>
+            <w:tcW w:w="3900" w:type="dxa"/>
+            <w:shd w:val="clear" w:color="auto" w:fill="FFFFFF"/>
+          </w:tcPr>
+          <w:p>
+            <w:pPr>
+              <w:jc w:val="left"/>
+              <w:spacing w:before="30" w:after="30" w:line="240" w:lineRule="auto"/>
+              <w:ind w:left="40" w:right="40"/>
+            </w:pPr>
+            <w:r>
+              <w:rPr>
+                <w:color w:val="333333"/>
+                <w:sz w:val="20"/>
+                <w:rFonts w:ascii="Calibri" w:hAnsi="Calibri"/>
+              </w:rPr>
+              <w:t xml:space="preserve"/>
+            </w:r>
+          </w:p>
+        </w:tc>
+        <w:tc>
+          <w:tcPr>
+            <w:tcW w:w="1800" w:type="dxa"/>
+            <w:shd w:val="clear" w:color="auto" w:fill="FFFFFF"/>
+          </w:tcPr>
+          <w:p>
+            <w:pPr>
+              <w:jc w:val="left"/>
+              <w:spacing w:before="30" w:after="30" w:line="240" w:lineRule="auto"/>
+              <w:ind w:left="40" w:right="40"/>
+            </w:pPr>
+            <w:r>
+              <w:rPr>
+                <w:b/>
+                <w:color w:val="1B4D3E"/>
+                <w:sz w:val="20"/>
+                <w:rFonts w:ascii="Calibri" w:hAnsi="Calibri"/>
+              </w:rPr>
+              <w:t xml:space="preserve">- Rp 2.500.000,-</w:t>
+            </w:r>
+          </w:p>
+        </w:tc>
+      </w:tr>
+      <w:tr>
+        <w:tc>
+          <w:tcPr>
+            <w:tcW w:w="600" w:type="dxa"/>
+            <w:shd w:val="clear" w:color="auto" w:fill="F9FBFA"/>
+          </w:tcPr>
+          <w:p>
+            <w:pPr>
+              <w:jc w:val="left"/>
+              <w:spacing w:before="30" w:after="30" w:line="240" w:lineRule="auto"/>
+              <w:ind w:left="40" w:right="40"/>
+            </w:pPr>
+            <w:r>
+              <w:rPr>
+                <w:color w:val="333333"/>
+                <w:sz w:val="20"/>
+                <w:rFonts w:ascii="Calibri" w:hAnsi="Calibri"/>
+              </w:rPr>
+              <w:t xml:space="preserve"/>
+            </w:r>
+          </w:p>
+        </w:tc>
+        <w:tc>
+          <w:tcPr>
+            <w:tcW w:w="3200" w:type="dxa"/>
+            <w:shd w:val="clear" w:color="auto" w:fill="F9FBFA"/>
+          </w:tcPr>
+          <w:p>
+            <w:pPr>
+              <w:jc w:val="left"/>
+              <w:spacing w:before="30" w:after="30" w:line="240" w:lineRule="auto"/>
+              <w:ind w:left="40" w:right="40"/>
+            </w:pPr>
+            <w:r>
+              <w:rPr>
+                <w:b/>
+                <w:color w:val="1B4D3E"/>
+                <w:sz w:val="20"/>
+                <w:rFonts w:ascii="Calibri" w:hAnsi="Calibri"/>
+              </w:rPr>
+              <w:t xml:space="preserve">TOTAL INVESTASI AKHIR (NET)</w:t>
+            </w:r>
+          </w:p>
+        </w:tc>
+        <w:tc>
+          <w:tcPr>
+            <w:tcW w:w="3900" w:type="dxa"/>
+            <w:shd w:val="clear" w:color="auto" w:fill="F9FBFA"/>
+          </w:tcPr>
+          <w:p>
+            <w:pPr>
+              <w:jc w:val="left"/>
+              <w:spacing w:before="30" w:after="30" w:line="240" w:lineRule="auto"/>
+              <w:ind w:left="40" w:right="40"/>
+            </w:pPr>
+            <w:r>
+              <w:rPr>
+                <w:color w:val="333333"/>
+                <w:sz w:val="20"/>
+                <w:rFonts w:ascii="Calibri" w:hAnsi="Calibri"/>
+              </w:rPr>
+              <w:t xml:space="preserve"/>
+            </w:r>
+          </w:p>
+        </w:tc>
+        <w:tc>
+          <w:tcPr>
+            <w:tcW w:w="1800" w:type="dxa"/>
+            <w:shd w:val="clear" w:color="auto" w:fill="F9FBFA"/>
+          </w:tcPr>
+          <w:p>
+            <w:pPr>
+              <w:jc w:val="left"/>
+              <w:spacing w:before="30" w:after="30" w:line="240" w:lineRule="auto"/>
+              <w:ind w:left="40" w:right="40"/>
+            </w:pPr>
+            <w:r>
+              <w:rPr>
+                <w:b/>
+                <w:color w:val="1B4D3E"/>
+                <w:sz w:val="20"/>
+                <w:rFonts w:ascii="Calibri" w:hAnsi="Calibri"/>
+              </w:rPr>
+              <w:t xml:space="preserve">Rp 12.500.000,-</w:t>
+            </w:r>
+          </w:p>
+        </w:tc>
+      </w:tr>
+    </w:tbl>
+    <w:p>
+      <w:pPr>
+        <w:jc w:val="left"/>
+        <w:spacing w:before="140" w:after="60" w:line="276" w:lineRule="auto"/>
+      </w:pPr>
+      <w:r>
+        <w:rPr>
+          <w:rFonts w:ascii="Calibri" w:hAnsi="Calibri"/>
+          <w:b/>
+          <w:color w:val="2E5A44"/>
+          <w:sz w:val="25"/>
+          <w:szCs w:val="25"/>
+        </w:rPr>
+        <w:t xml:space="preserve">4.3 Biaya Infrastruktur Pihak Ketiga (Milik Yayasan)</w:t>
+      </w:r>
+    </w:p>
+    <w:p>
+      <w:pPr>
+        <w:pBdr>
+          <w:left w:val="single" w:sz="24" w:space="12" w:color="1B4D3E"/>
+        </w:pBdr>
+        <w:shd w:val="clear" w:color="auto" w:fill="F0F6F3"/>
+        <w:spacing w:before="60" w:after="60" w:line="260" w:lineRule="auto"/>
+        <w:ind w:left="240" w:right="240"/>
+      </w:pPr>
+      <w:r>
+        <w:rPr>
+          <w:b/>
+          <w:color w:val="1B4D3E"/>
+          <w:sz w:val="21"/>
+          <w:szCs w:val="21"/>
+        </w:rPr>
+        <w:t xml:space="preserve">TRANSPARANSI BIAYA SERVER: </w:t>
+      </w:r>
+      <w:r>
+        <w:rPr>
+          <w:i/>
+          <w:color w:val="333333"/>
+          <w:sz w:val="21"/>
+          <w:szCs w:val="21"/>
+        </w:rPr>
+        <w:t xml:space="preserve">Catatan: Biaya domain dan server merupakan biaya sewa tahunan resmi yang dibayarkan langsung ke penyedia hosting/PANDI atas nama kepemilikan Majlis Al-Ihya Bogor (kami siap mendampingi proses registrasinya).</w:t>
+      </w:r>
+    </w:p>
+    <w:p>
+      <w:pPr>
+        <w:ind w:left="360" w:hanging="240"/>
+        <w:spacing w:before="40" w:after="40" w:line="260" w:lineRule="auto"/>
+      </w:pPr>
+      <w:r>
+        <w:rPr>
+          <w:b/>
+          <w:color w:val="1B4D3E"/>
+          <w:sz w:val="22"/>
+          <w:szCs w:val="22"/>
+        </w:rPr>
+        <w:t xml:space="preserve">•  </w:t>
+      </w:r>
+      <w:r>
+        <w:rPr>
+          <w:b/>
+          <w:color w:val="222222"/>
+          <w:sz w:val="22"/>
+          <w:szCs w:val="22"/>
+        </w:rPr>
+        <w:t xml:space="preserve">Domain Resmi majlisalihyabogor.id (.id): </w:t>
+      </w:r>
+      <w:r>
+        <w:rPr>
+          <w:color w:val="444444"/>
+          <w:sz w:val="22"/>
+          <w:szCs w:val="22"/>
+        </w:rPr>
+        <w:t xml:space="preserve">Rp 200.000 s/d Rp 250.000 / tahun (Domain tingkat tinggi resmi Indonesia .id).</w:t>
+      </w:r>
+    </w:p>
+    <w:p>
+      <w:pPr>
+        <w:ind w:left="360" w:hanging="240"/>
+        <w:spacing w:before="40" w:after="40" w:line="260" w:lineRule="auto"/>
+      </w:pPr>
+      <w:r>
+        <w:rPr>
+          <w:b/>
+          <w:color w:val="1B4D3E"/>
+          <w:sz w:val="22"/>
+          <w:szCs w:val="22"/>
+        </w:rPr>
+        <w:t xml:space="preserve">•  </w:t>
+      </w:r>
+      <w:r>
+        <w:rPr>
+          <w:b/>
+          <w:color w:val="222222"/>
+          <w:sz w:val="22"/>
+          <w:szCs w:val="22"/>
+        </w:rPr>
+        <w:t xml:space="preserve">Cloud Hosting / VPS (RAM 2GB, SSD NVMe): </w:t>
+      </w:r>
+      <w:r>
+        <w:rPr>
+          <w:color w:val="444444"/>
+          <w:sz w:val="22"/>
+          <w:szCs w:val="22"/>
+        </w:rPr>
+        <w:t xml:space="preserve">Rp 800.000 s/d Rp 1.200.000 / tahun (Kapasitas ideal untuk menampung ribuan trafik pendaftar santri).</w:t>
+      </w:r>
+    </w:p>
+    <w:p>
+      <w:pPr>
+        <w:ind w:left="360" w:hanging="240"/>
+        <w:spacing w:before="40" w:after="40" w:line="260" w:lineRule="auto"/>
+      </w:pPr>
+      <w:r>
+        <w:rPr>
+          <w:b/>
+          <w:color w:val="1B4D3E"/>
+          <w:sz w:val="22"/>
+          <w:szCs w:val="22"/>
+        </w:rPr>
+        <w:t xml:space="preserve">•  </w:t>
+      </w:r>
+      <w:r>
+        <w:rPr>
+          <w:b/>
+          <w:color w:val="222222"/>
+          <w:sz w:val="22"/>
+          <w:szCs w:val="22"/>
+        </w:rPr>
+        <w:t xml:space="preserve">Sertifikat Keamanan SSL (HTTPS): </w:t>
+      </w:r>
+      <w:r>
+        <w:rPr>
+          <w:color w:val="444444"/>
+          <w:sz w:val="22"/>
+          <w:szCs w:val="22"/>
+        </w:rPr>
+        <w:t xml:space="preserve">GRATIS (Menggunakan Let's Encrypt / Cloudflare Security).</w:t>
+      </w:r>
+    </w:p>
+    <w:p>
+      <w:pPr>
+        <w:jc w:val="left"/>
+        <w:spacing w:before="140" w:after="60" w:line="276" w:lineRule="auto"/>
+      </w:pPr>
+      <w:r>
+        <w:rPr>
+          <w:rFonts w:ascii="Calibri" w:hAnsi="Calibri"/>
+          <w:b/>
+          <w:color w:val="2E5A44"/>
+          <w:sz w:val="25"/>
+          <w:szCs w:val="25"/>
+        </w:rPr>
+        <w:t xml:space="preserve">4.4 Skema &amp; Tahapan Pembayaran</w:t>
+      </w:r>
+    </w:p>
+    <w:p>
+      <w:pPr>
+        <w:ind w:left="360" w:hanging="240"/>
+        <w:spacing w:before="40" w:after="40" w:line="260" w:lineRule="auto"/>
+      </w:pPr>
+      <w:r>
+        <w:rPr>
+          <w:b/>
+          <w:color w:val="1B4D3E"/>
+          <w:sz w:val="22"/>
+          <w:szCs w:val="22"/>
+        </w:rPr>
+        <w:t xml:space="preserve">•  </w:t>
+      </w:r>
+      <w:r>
+        <w:rPr>
+          <w:b/>
+          <w:color w:val="222222"/>
+          <w:sz w:val="22"/>
+          <w:szCs w:val="22"/>
+        </w:rPr>
+        <w:t xml:space="preserve">Termin I — Uang Muka (DP 40%) : Rp 5.000.000,-: </w:t>
+      </w:r>
+      <w:r>
+        <w:rPr>
+          <w:color w:val="444444"/>
+          <w:sz w:val="22"/>
+          <w:szCs w:val="22"/>
+        </w:rPr>
+        <w:t xml:space="preserve">Dibayarkan saat penandatanganan kesepakatan kerja dan sebelum proyek dimulai sebagai komitmen pengerjaan.</w:t>
+      </w:r>
+    </w:p>
+    <w:p>
+      <w:pPr>
+        <w:ind w:left="360" w:hanging="240"/>
+        <w:spacing w:before="40" w:after="40" w:line="260" w:lineRule="auto"/>
+      </w:pPr>
+      <w:r>
+        <w:rPr>
+          <w:b/>
+          <w:color w:val="1B4D3E"/>
+          <w:sz w:val="22"/>
+          <w:szCs w:val="22"/>
+        </w:rPr>
+        <w:t xml:space="preserve">•  </w:t>
+      </w:r>
+      <w:r>
+        <w:rPr>
+          <w:b/>
+          <w:color w:val="222222"/>
+          <w:sz w:val="22"/>
+          <w:szCs w:val="22"/>
+        </w:rPr>
+        <w:t xml:space="preserve">Termin II — Progres / UAT (40%) : Rp 5.000.000,-: </w:t>
+      </w:r>
+      <w:r>
+        <w:rPr>
+          <w:color w:val="444444"/>
+          <w:sz w:val="22"/>
+          <w:szCs w:val="22"/>
+        </w:rPr>
+        <w:t xml:space="preserve">Dibayarkan saat seluruh sistem selesai dibangun dan dipresentasikan di link demo/staging.</w:t>
+      </w:r>
+    </w:p>
+    <w:p>
+      <w:pPr>
+        <w:ind w:left="360" w:hanging="240"/>
+        <w:spacing w:before="40" w:after="40" w:line="260" w:lineRule="auto"/>
+      </w:pPr>
+      <w:r>
+        <w:rPr>
+          <w:b/>
+          <w:color w:val="1B4D3E"/>
+          <w:sz w:val="22"/>
+          <w:szCs w:val="22"/>
+        </w:rPr>
+        <w:t xml:space="preserve">•  </w:t>
+      </w:r>
+      <w:r>
+        <w:rPr>
+          <w:b/>
+          <w:color w:val="222222"/>
+          <w:sz w:val="22"/>
+          <w:szCs w:val="22"/>
+        </w:rPr>
+        <w:t xml:space="preserve">Termin III — Pelunasan (20%) : Rp 2.500.000,-: </w:t>
+      </w:r>
+      <w:r>
+        <w:rPr>
+          <w:color w:val="444444"/>
+          <w:sz w:val="22"/>
+          <w:szCs w:val="22"/>
+        </w:rPr>
+        <w:t xml:space="preserve">Dibayarkan setelah proses peluncuran resmi (Go-Live) di domain utama dan pelatihan admin selesai.</w:t>
+      </w:r>
+    </w:p>
+    <w:p>
+      <w:r>
+        <w:br w:type="page"/>
+      </w:r>
+    </w:p>
+    <w:p>
+      <w:pPr>
+        <w:jc w:val="left"/>
+        <w:spacing w:before="360" w:after="140" w:line="276" w:lineRule="auto"/>
+      </w:pPr>
+      <w:r>
+        <w:rPr>
+          <w:rFonts w:ascii="Calibri" w:hAnsi="Calibri"/>
+          <w:b/>
+          <w:color w:val="1B4D3E"/>
+          <w:sz w:val="28"/>
+          <w:szCs w:val="28"/>
+        </w:rPr>
+        <w:t xml:space="preserve">BAB V. KEBUTUHAN DATA DARI PIHAK YAYASAN (PREREQUISITES)</w:t>
+      </w:r>
+    </w:p>
+    <w:p>
+      <w:pPr>
+        <w:spacing w:before="120" w:after="120" w:line="276" w:lineRule="auto"/>
+      </w:pPr>
+      <w:r>
+        <w:rPr/>
+        <w:t xml:space="preserve">Untuk menjamin kelancaran pengerjaan sesuai timeline, pihak yayasan diharapkan dapat menyediakan data berikut:</w:t>
       </w:r>
     </w:p>
     <w:tbl>
@@ -4353,7 +5500,7 @@
         </w:tc>
         <w:tc>
           <w:tcPr>
-            <w:tcW w:w="3200" w:type="dxa"/>
+            <w:tcW w:w="2600" w:type="dxa"/>
             <w:shd w:val="clear" w:color="auto" w:fill="1B4D3E"/>
           </w:tcPr>
           <w:p>
@@ -4368,13 +5515,13 @@
                 <w:sz w:val="21"/>
                 <w:rFonts w:ascii="Calibri" w:hAnsi="Calibri"/>
               </w:rPr>
-              <w:t xml:space="preserve">Komponen Pekerjaan</w:t>
-            </w:r>
-          </w:p>
-        </w:tc>
-        <w:tc>
-          <w:tcPr>
-            <w:tcW w:w="3900" w:type="dxa"/>
+              <w:t xml:space="preserve">Kategori Kebutuhan</w:t>
+            </w:r>
+          </w:p>
+        </w:tc>
+        <w:tc>
+          <w:tcPr>
+            <w:tcW w:w="4500" w:type="dxa"/>
             <w:shd w:val="clear" w:color="auto" w:fill="1B4D3E"/>
           </w:tcPr>
           <w:p>
@@ -4389,7 +5536,7 @@
                 <w:sz w:val="21"/>
                 <w:rFonts w:ascii="Calibri" w:hAnsi="Calibri"/>
               </w:rPr>
-              <w:t xml:space="preserve">Uraian Teknis &amp; Deliverables</w:t>
+              <w:t xml:space="preserve">Rincian Data yang Diperlukan</w:t>
             </w:r>
           </w:p>
         </w:tc>
@@ -4410,7 +5557,7 @@
                 <w:sz w:val="21"/>
                 <w:rFonts w:ascii="Calibri" w:hAnsi="Calibri"/>
               </w:rPr>
-              <w:t xml:space="preserve">Alokasi Nilai</w:t>
+              <w:t xml:space="preserve">Keterangan</w:t>
             </w:r>
           </w:p>
         </w:tc>
@@ -4439,7 +5586,7 @@
         </w:tc>
         <w:tc>
           <w:tcPr>
-            <w:tcW w:w="3200" w:type="dxa"/>
+            <w:tcW w:w="2600" w:type="dxa"/>
             <w:shd w:val="clear" w:color="auto" w:fill="FFFFFF"/>
           </w:tcPr>
           <w:p>
@@ -4455,13 +5602,13 @@
                 <w:sz w:val="20"/>
                 <w:rFonts w:ascii="Calibri" w:hAnsi="Calibri"/>
               </w:rPr>
-              <w:t xml:space="preserve">Arsitektur Multi-Subdomain &amp; Core Engine</w:t>
-            </w:r>
-          </w:p>
-        </w:tc>
-        <w:tc>
-          <w:tcPr>
-            <w:tcW w:w="3900" w:type="dxa"/>
+              <w:t xml:space="preserve">Akses Hosting &amp; Domain</w:t>
+            </w:r>
+          </w:p>
+        </w:tc>
+        <w:tc>
+          <w:tcPr>
+            <w:tcW w:w="4500" w:type="dxa"/>
             <w:shd w:val="clear" w:color="auto" w:fill="FFFFFF"/>
           </w:tcPr>
           <w:p>
@@ -4476,7 +5623,7 @@
                 <w:sz w:val="20"/>
                 <w:rFonts w:ascii="Calibri" w:hAnsi="Calibri"/>
               </w:rPr>
-              <w:t xml:space="preserve">Setup DNS wildcard, subdomain routing (pp, md, mt), multi-tenant middleware, struktur database terpadu</w:t>
+              <w:t xml:space="preserve">Informasi login cPanel/panel domain lama (jika sudah memiliki website sebelumnya).</w:t>
             </w:r>
           </w:p>
         </w:tc>
@@ -4497,7 +5644,7 @@
                 <w:sz w:val="20"/>
                 <w:rFonts w:ascii="Calibri" w:hAnsi="Calibri"/>
               </w:rPr>
-              <w:t xml:space="preserve">Rp 2.500.000</w:t>
+              <w:t xml:space="preserve">Wajib</w:t>
             </w:r>
           </w:p>
         </w:tc>
@@ -4526,7 +5673,7 @@
         </w:tc>
         <w:tc>
           <w:tcPr>
-            <w:tcW w:w="3200" w:type="dxa"/>
+            <w:tcW w:w="2600" w:type="dxa"/>
             <w:shd w:val="clear" w:color="auto" w:fill="F9FBFA"/>
           </w:tcPr>
           <w:p>
@@ -4542,13 +5689,13 @@
                 <w:sz w:val="20"/>
                 <w:rFonts w:ascii="Calibri" w:hAnsi="Calibri"/>
               </w:rPr>
-              <w:t xml:space="preserve">UI/UX &amp; Front-End 4 Portal Web</w:t>
-            </w:r>
-          </w:p>
-        </w:tc>
-        <w:tc>
-          <w:tcPr>
-            <w:tcW w:w="3900" w:type="dxa"/>
+              <w:t xml:space="preserve">Legalitas Yayasan</w:t>
+            </w:r>
+          </w:p>
+        </w:tc>
+        <w:tc>
+          <w:tcPr>
+            <w:tcW w:w="4500" w:type="dxa"/>
             <w:shd w:val="clear" w:color="auto" w:fill="F9FBFA"/>
           </w:tcPr>
           <w:p>
@@ -4563,7 +5710,7 @@
                 <w:sz w:val="20"/>
                 <w:rFonts w:ascii="Calibri" w:hAnsi="Calibri"/>
               </w:rPr>
-              <w:t xml:space="preserve">Desain responsif mobile Portal Utama, Ponpes Al-Ihya, Madrasah Diniah, dan Majelis Taklim (termasuk Jadwal Sholat &amp; Live Stream)</w:t>
+              <w:t xml:space="preserve">Scan SK Kemenkumham / Kemenag / Izin Operasional untuk registrasi &amp; administrasi domain majlisalihyabogor.id.</w:t>
             </w:r>
           </w:p>
         </w:tc>
@@ -4584,7 +5731,7 @@
                 <w:sz w:val="20"/>
                 <w:rFonts w:ascii="Calibri" w:hAnsi="Calibri"/>
               </w:rPr>
-              <w:t xml:space="preserve">Rp 4.500.000</w:t>
+              <w:t xml:space="preserve">Wajib</w:t>
             </w:r>
           </w:p>
         </w:tc>
@@ -4613,7 +5760,7 @@
         </w:tc>
         <w:tc>
           <w:tcPr>
-            <w:tcW w:w="3200" w:type="dxa"/>
+            <w:tcW w:w="2600" w:type="dxa"/>
             <w:shd w:val="clear" w:color="auto" w:fill="FFFFFF"/>
           </w:tcPr>
           <w:p>
@@ -4629,13 +5776,13 @@
                 <w:sz w:val="20"/>
                 <w:rFonts w:ascii="Calibri" w:hAnsi="Calibri"/>
               </w:rPr>
-              <w:t xml:space="preserve">CMS Back-Office Terpadu &amp; Multi-Role</w:t>
-            </w:r>
-          </w:p>
-        </w:tc>
-        <w:tc>
-          <w:tcPr>
-            <w:tcW w:w="3900" w:type="dxa"/>
+              <w:t xml:space="preserve">Identitas &amp; Kontak</w:t>
+            </w:r>
+          </w:p>
+        </w:tc>
+        <w:tc>
+          <w:tcPr>
+            <w:tcW w:w="4500" w:type="dxa"/>
             <w:shd w:val="clear" w:color="auto" w:fill="FFFFFF"/>
           </w:tcPr>
           <w:p>
@@ -4650,7 +5797,7 @@
                 <w:sz w:val="20"/>
                 <w:rFonts w:ascii="Calibri" w:hAnsi="Calibri"/>
               </w:rPr>
-              <w:t xml:space="preserve">Dashboard admin terisolasi untuk berita, galeri foto/video, agenda kajian, tata tertib, dan media manager</w:t>
+              <w:t xml:space="preserve">Daftar pengurus inti, nomor WhatsApp &amp; email resmi yayasan, ponpes, madrasah, dan majlis.</w:t>
             </w:r>
           </w:p>
         </w:tc>
@@ -4671,7 +5818,7 @@
                 <w:sz w:val="20"/>
                 <w:rFonts w:ascii="Calibri" w:hAnsi="Calibri"/>
               </w:rPr>
-              <w:t xml:space="preserve">Rp 3.500.000</w:t>
+              <w:t xml:space="preserve">Wajib</w:t>
             </w:r>
           </w:p>
         </w:tc>
@@ -4700,7 +5847,7 @@
         </w:tc>
         <w:tc>
           <w:tcPr>
-            <w:tcW w:w="3200" w:type="dxa"/>
+            <w:tcW w:w="2600" w:type="dxa"/>
             <w:shd w:val="clear" w:color="auto" w:fill="F9FBFA"/>
           </w:tcPr>
           <w:p>
@@ -4716,13 +5863,13 @@
                 <w:sz w:val="20"/>
                 <w:rFonts w:ascii="Calibri" w:hAnsi="Calibri"/>
               </w:rPr>
-              <w:t xml:space="preserve">Modul Portal PPDB Online Terpadu</w:t>
-            </w:r>
-          </w:p>
-        </w:tc>
-        <w:tc>
-          <w:tcPr>
-            <w:tcW w:w="3900" w:type="dxa"/>
+              <w:t xml:space="preserve">Aset Profil &amp; Media</w:t>
+            </w:r>
+          </w:p>
+        </w:tc>
+        <w:tc>
+          <w:tcPr>
+            <w:tcW w:w="4500" w:type="dxa"/>
             <w:shd w:val="clear" w:color="auto" w:fill="F9FBFA"/>
           </w:tcPr>
           <w:p>
@@ -4737,7 +5884,7 @@
                 <w:sz w:val="20"/>
                 <w:rFonts w:ascii="Calibri" w:hAnsi="Calibri"/>
               </w:rPr>
-              <w:t xml:space="preserve">Form wizard pendaftaran, upload berkas KK/Akta/Foto, cek status mandiri, kartu PDF, export data Excel</w:t>
+              <w:t xml:space="preserve">Logo resolusi tinggi, foto sarana prasarana, foto pengasuh/asatidz, dan visi-misi yayasan.</w:t>
             </w:r>
           </w:p>
         </w:tc>
@@ -4758,7 +5905,7 @@
                 <w:sz w:val="20"/>
                 <w:rFonts w:ascii="Calibri" w:hAnsi="Calibri"/>
               </w:rPr>
-              <w:t xml:space="preserve">Rp 3.500.000</w:t>
+              <w:t xml:space="preserve">Wajib</w:t>
             </w:r>
           </w:p>
         </w:tc>
@@ -4787,7 +5934,7 @@
         </w:tc>
         <w:tc>
           <w:tcPr>
-            <w:tcW w:w="3200" w:type="dxa"/>
+            <w:tcW w:w="2600" w:type="dxa"/>
             <w:shd w:val="clear" w:color="auto" w:fill="FFFFFF"/>
           </w:tcPr>
           <w:p>
@@ -4803,13 +5950,13 @@
                 <w:sz w:val="20"/>
                 <w:rFonts w:ascii="Calibri" w:hAnsi="Calibri"/>
               </w:rPr>
-              <w:t xml:space="preserve">Testing, Training &amp; Manual Guide PDF</w:t>
-            </w:r>
-          </w:p>
-        </w:tc>
-        <w:tc>
-          <w:tcPr>
-            <w:tcW w:w="3900" w:type="dxa"/>
+              <w:t xml:space="preserve">Formulir &amp; Alur PPDB</w:t>
+            </w:r>
+          </w:p>
+        </w:tc>
+        <w:tc>
+          <w:tcPr>
+            <w:tcW w:w="4500" w:type="dxa"/>
             <w:shd w:val="clear" w:color="auto" w:fill="FFFFFF"/>
           </w:tcPr>
           <w:p>
@@ -4824,7 +5971,7 @@
                 <w:sz w:val="20"/>
                 <w:rFonts w:ascii="Calibri" w:hAnsi="Calibri"/>
               </w:rPr>
-              <w:t xml:space="preserve">Uji coba keamanan sistem, pelatihan intensif operator/panitia PPDB, penyusunan buku panduan penggunaan</w:t>
+              <w:t xml:space="preserve">Berkas formulir pendaftaran manual tahun lalu, rincian biaya pendaftaran, &amp; no. rekening bank.</w:t>
             </w:r>
           </w:p>
         </w:tc>
@@ -4845,7 +5992,7 @@
                 <w:sz w:val="20"/>
                 <w:rFonts w:ascii="Calibri" w:hAnsi="Calibri"/>
               </w:rPr>
-              <w:t xml:space="preserve">Rp 1.000.000</w:t>
+              <w:t xml:space="preserve">Wajib</w:t>
             </w:r>
           </w:p>
         </w:tc>
@@ -4868,13 +6015,13 @@
                 <w:sz w:val="20"/>
                 <w:rFonts w:ascii="Calibri" w:hAnsi="Calibri"/>
               </w:rPr>
-              <w:t xml:space="preserve"/>
-            </w:r>
-          </w:p>
-        </w:tc>
-        <w:tc>
-          <w:tcPr>
-            <w:tcW w:w="3200" w:type="dxa"/>
+              <w:t xml:space="preserve">6</w:t>
+            </w:r>
+          </w:p>
+        </w:tc>
+        <w:tc>
+          <w:tcPr>
+            <w:tcW w:w="2600" w:type="dxa"/>
             <w:shd w:val="clear" w:color="auto" w:fill="F9FBFA"/>
           </w:tcPr>
           <w:p>
@@ -4890,13 +6037,13 @@
                 <w:sz w:val="20"/>
                 <w:rFonts w:ascii="Calibri" w:hAnsi="Calibri"/>
               </w:rPr>
-              <w:t xml:space="preserve">Total Nilai Standar Pekerjaan</w:t>
-            </w:r>
-          </w:p>
-        </w:tc>
-        <w:tc>
-          <w:tcPr>
-            <w:tcW w:w="3900" w:type="dxa"/>
+              <w:t xml:space="preserve">Penunjukan Admin Unit</w:t>
+            </w:r>
+          </w:p>
+        </w:tc>
+        <w:tc>
+          <w:tcPr>
+            <w:tcW w:w="4500" w:type="dxa"/>
             <w:shd w:val="clear" w:color="auto" w:fill="F9FBFA"/>
           </w:tcPr>
           <w:p>
@@ -4911,7 +6058,7 @@
                 <w:sz w:val="20"/>
                 <w:rFonts w:ascii="Calibri" w:hAnsi="Calibri"/>
               </w:rPr>
-              <w:t xml:space="preserve"/>
+              <w:t xml:space="preserve">Nama dan kontak staf yang ditunjuk menjadi operator web Ponpes, Madrasah, dan Majlis Ta'lim.</w:t>
             </w:r>
           </w:p>
         </w:tc>
@@ -4928,188 +6075,11 @@
             </w:pPr>
             <w:r>
               <w:rPr>
-                <w:b/>
-                <w:color w:val="333333"/>
-                <w:sz w:val="20"/>
-                <w:rFonts w:ascii="Calibri" w:hAnsi="Calibri"/>
-              </w:rPr>
-              <w:t xml:space="preserve">Rp 15.000.000,-</w:t>
-            </w:r>
-          </w:p>
-        </w:tc>
-      </w:tr>
-      <w:tr>
-        <w:tc>
-          <w:tcPr>
-            <w:tcW w:w="600" w:type="dxa"/>
-            <w:shd w:val="clear" w:color="auto" w:fill="FFFFFF"/>
-          </w:tcPr>
-          <w:p>
-            <w:pPr>
-              <w:jc w:val="left"/>
-              <w:spacing w:before="60" w:after="60"/>
-              <w:ind w:left="40" w:right="40"/>
-            </w:pPr>
-            <w:r>
-              <w:rPr>
-                <w:color w:val="333333"/>
-                <w:sz w:val="20"/>
-                <w:rFonts w:ascii="Calibri" w:hAnsi="Calibri"/>
-              </w:rPr>
-              <w:t xml:space="preserve"/>
-            </w:r>
-          </w:p>
-        </w:tc>
-        <w:tc>
-          <w:tcPr>
-            <w:tcW w:w="3200" w:type="dxa"/>
-            <w:shd w:val="clear" w:color="auto" w:fill="FFFFFF"/>
-          </w:tcPr>
-          <w:p>
-            <w:pPr>
-              <w:jc w:val="left"/>
-              <w:spacing w:before="60" w:after="60"/>
-              <w:ind w:left="40" w:right="40"/>
-            </w:pPr>
-            <w:r>
-              <w:rPr>
-                <w:b/>
-                <w:color w:val="1B4D3E"/>
-                <w:sz w:val="20"/>
-                <w:rFonts w:ascii="Calibri" w:hAnsi="Calibri"/>
-              </w:rPr>
-              <w:t xml:space="preserve">Subsidi Apresiasi Kemitraan Digital</w:t>
-            </w:r>
-          </w:p>
-        </w:tc>
-        <w:tc>
-          <w:tcPr>
-            <w:tcW w:w="3900" w:type="dxa"/>
-            <w:shd w:val="clear" w:color="auto" w:fill="FFFFFF"/>
-          </w:tcPr>
-          <w:p>
-            <w:pPr>
-              <w:jc w:val="left"/>
-              <w:spacing w:before="60" w:after="60"/>
-              <w:ind w:left="40" w:right="40"/>
-            </w:pPr>
-            <w:r>
-              <w:rPr>
-                <w:color w:val="333333"/>
-                <w:sz w:val="20"/>
-                <w:rFonts w:ascii="Calibri" w:hAnsi="Calibri"/>
-              </w:rPr>
-              <w:t xml:space="preserve"/>
-            </w:r>
-          </w:p>
-        </w:tc>
-        <w:tc>
-          <w:tcPr>
-            <w:tcW w:w="1800" w:type="dxa"/>
-            <w:shd w:val="clear" w:color="auto" w:fill="FFFFFF"/>
-          </w:tcPr>
-          <w:p>
-            <w:pPr>
-              <w:jc w:val="left"/>
-              <w:spacing w:before="60" w:after="60"/>
-              <w:ind w:left="40" w:right="40"/>
-            </w:pPr>
-            <w:r>
-              <w:rPr>
-                <w:b/>
-                <w:color w:val="1B4D3E"/>
-                <w:sz w:val="20"/>
-                <w:rFonts w:ascii="Calibri" w:hAnsi="Calibri"/>
-              </w:rPr>
-              <w:t xml:space="preserve">- Rp 2.500.000,-</w:t>
-            </w:r>
-          </w:p>
-        </w:tc>
-      </w:tr>
-      <w:tr>
-        <w:tc>
-          <w:tcPr>
-            <w:tcW w:w="600" w:type="dxa"/>
-            <w:shd w:val="clear" w:color="auto" w:fill="F9FBFA"/>
-          </w:tcPr>
-          <w:p>
-            <w:pPr>
-              <w:jc w:val="left"/>
-              <w:spacing w:before="60" w:after="60"/>
-              <w:ind w:left="40" w:right="40"/>
-            </w:pPr>
-            <w:r>
-              <w:rPr>
-                <w:color w:val="333333"/>
-                <w:sz w:val="20"/>
-                <w:rFonts w:ascii="Calibri" w:hAnsi="Calibri"/>
-              </w:rPr>
-              <w:t xml:space="preserve"/>
-            </w:r>
-          </w:p>
-        </w:tc>
-        <w:tc>
-          <w:tcPr>
-            <w:tcW w:w="3200" w:type="dxa"/>
-            <w:shd w:val="clear" w:color="auto" w:fill="F9FBFA"/>
-          </w:tcPr>
-          <w:p>
-            <w:pPr>
-              <w:jc w:val="left"/>
-              <w:spacing w:before="60" w:after="60"/>
-              <w:ind w:left="40" w:right="40"/>
-            </w:pPr>
-            <w:r>
-              <w:rPr>
-                <w:b/>
-                <w:color w:val="1B4D3E"/>
-                <w:sz w:val="20"/>
-                <w:rFonts w:ascii="Calibri" w:hAnsi="Calibri"/>
-              </w:rPr>
-              <w:t xml:space="preserve">TOTAL INVESTASI AKHIR (NET)</w:t>
-            </w:r>
-          </w:p>
-        </w:tc>
-        <w:tc>
-          <w:tcPr>
-            <w:tcW w:w="3900" w:type="dxa"/>
-            <w:shd w:val="clear" w:color="auto" w:fill="F9FBFA"/>
-          </w:tcPr>
-          <w:p>
-            <w:pPr>
-              <w:jc w:val="left"/>
-              <w:spacing w:before="60" w:after="60"/>
-              <w:ind w:left="40" w:right="40"/>
-            </w:pPr>
-            <w:r>
-              <w:rPr>
-                <w:color w:val="333333"/>
-                <w:sz w:val="20"/>
-                <w:rFonts w:ascii="Calibri" w:hAnsi="Calibri"/>
-              </w:rPr>
-              <w:t xml:space="preserve"/>
-            </w:r>
-          </w:p>
-        </w:tc>
-        <w:tc>
-          <w:tcPr>
-            <w:tcW w:w="1800" w:type="dxa"/>
-            <w:shd w:val="clear" w:color="auto" w:fill="F9FBFA"/>
-          </w:tcPr>
-          <w:p>
-            <w:pPr>
-              <w:jc w:val="left"/>
-              <w:spacing w:before="60" w:after="60"/>
-              <w:ind w:left="40" w:right="40"/>
-            </w:pPr>
-            <w:r>
-              <w:rPr>
-                <w:b/>
-                <w:color w:val="1B4D3E"/>
-                <w:sz w:val="20"/>
-                <w:rFonts w:ascii="Calibri" w:hAnsi="Calibri"/>
-              </w:rPr>
-              <w:t xml:space="preserve">Rp 12.500.000,-</w:t>
+                <w:color w:val="333333"/>
+                <w:sz w:val="20"/>
+                <w:rFonts w:ascii="Calibri" w:hAnsi="Calibri"/>
+              </w:rPr>
+              <w:t xml:space="preserve">Wajib</w:t>
             </w:r>
           </w:p>
         </w:tc>
@@ -5117,8 +6087,29 @@
     </w:tbl>
     <w:p>
       <w:pPr>
-        <w:spacing w:before="100" w:after="100" w:line="276" w:lineRule="auto"/>
-      </w:pPr>
+        <w:spacing w:before="80" w:after="80" w:line="276" w:lineRule="auto"/>
+      </w:pPr>
+    </w:p>
+    <w:p>
+      <w:r>
+        <w:br w:type="page"/>
+      </w:r>
+    </w:p>
+    <w:p>
+      <w:pPr>
+        <w:jc w:val="left"/>
+        <w:spacing w:before="360" w:after="140" w:line="276" w:lineRule="auto"/>
+      </w:pPr>
+      <w:r>
+        <w:rPr>
+          <w:rFonts w:ascii="Calibri" w:hAnsi="Calibri"/>
+          <w:b/>
+          <w:color w:val="1B4D3E"/>
+          <w:sz w:val="28"/>
+          <w:szCs w:val="28"/>
+        </w:rPr>
+        <w:t xml:space="preserve">BAB VI. GARANSI, PEMELIHARAAN &amp; PELATIHAN</w:t>
+      </w:r>
     </w:p>
     <w:p>
       <w:pPr>
@@ -5133,131 +6124,16 @@
           <w:sz w:val="25"/>
           <w:szCs w:val="25"/>
         </w:rPr>
-        <w:t xml:space="preserve">4.3 Biaya Infrastruktur Pihak Ketiga (Milik Yayasan)</w:t>
-      </w:r>
-    </w:p>
-    <w:p>
-      <w:pPr>
-        <w:pBdr>
-          <w:left w:val="single" w:sz="24" w:space="12" w:color="1B4D3E"/>
-        </w:pBdr>
-        <w:shd w:val="clear" w:color="auto" w:fill="F0F6F3"/>
-        <w:spacing w:before="140" w:after="140" w:line="260" w:lineRule="auto"/>
-        <w:ind w:left="240" w:right="240"/>
-      </w:pPr>
-      <w:r>
-        <w:rPr>
-          <w:b/>
-          <w:color w:val="1B4D3E"/>
-          <w:sz w:val="21"/>
-          <w:szCs w:val="21"/>
-        </w:rPr>
-        <w:t xml:space="preserve">TRANSPARANSI BIAYA SERVER: </w:t>
-      </w:r>
-      <w:r>
-        <w:rPr>
-          <w:i/>
-          <w:color w:val="333333"/>
-          <w:sz w:val="21"/>
-          <w:szCs w:val="21"/>
-        </w:rPr>
-        <w:t xml:space="preserve">Catatan: Biaya domain dan server merupakan biaya sewa tahunan resmi yang dibayarkan langsung ke penyedia hosting/PANDI atas nama kepemilikan Majlis Al-Ihya Bogor (kami siap mendampingi proses registrasinya).</w:t>
-      </w:r>
-    </w:p>
-    <w:p>
-      <w:pPr>
-        <w:ind w:left="360" w:hanging="240"/>
-        <w:spacing w:before="60" w:after="60" w:line="260" w:lineRule="auto"/>
-      </w:pPr>
-      <w:r>
-        <w:rPr>
-          <w:b/>
-          <w:color w:val="1B4D3E"/>
-          <w:sz w:val="22"/>
-          <w:szCs w:val="22"/>
-        </w:rPr>
-        <w:t xml:space="preserve">•  </w:t>
-      </w:r>
-      <w:r>
-        <w:rPr>
-          <w:b/>
-          <w:color w:val="222222"/>
-          <w:sz w:val="22"/>
-          <w:szCs w:val="22"/>
-        </w:rPr>
-        <w:t xml:space="preserve">Domain Resmi majlisalihyabogor.id (.id): </w:t>
-      </w:r>
-      <w:r>
-        <w:rPr>
-          <w:color w:val="444444"/>
-          <w:sz w:val="22"/>
-          <w:szCs w:val="22"/>
-        </w:rPr>
-        <w:t xml:space="preserve">Rp 200.000 s/d Rp 250.000 / tahun (Domain tingkat tinggi resmi Indonesia .id).</w:t>
-      </w:r>
-    </w:p>
-    <w:p>
-      <w:pPr>
-        <w:ind w:left="360" w:hanging="240"/>
-        <w:spacing w:before="60" w:after="60" w:line="260" w:lineRule="auto"/>
-      </w:pPr>
-      <w:r>
-        <w:rPr>
-          <w:b/>
-          <w:color w:val="1B4D3E"/>
-          <w:sz w:val="22"/>
-          <w:szCs w:val="22"/>
-        </w:rPr>
-        <w:t xml:space="preserve">•  </w:t>
-      </w:r>
-      <w:r>
-        <w:rPr>
-          <w:b/>
-          <w:color w:val="222222"/>
-          <w:sz w:val="22"/>
-          <w:szCs w:val="22"/>
-        </w:rPr>
-        <w:t xml:space="preserve">Cloud Hosting / VPS (RAM 2GB, SSD NVMe): </w:t>
-      </w:r>
-      <w:r>
-        <w:rPr>
-          <w:color w:val="444444"/>
-          <w:sz w:val="22"/>
-          <w:szCs w:val="22"/>
-        </w:rPr>
-        <w:t xml:space="preserve">Rp 800.000 s/d Rp 1.200.000 / tahun (Kapasitas ideal untuk menampung ribuan trafik pendaftar santri).</w:t>
-      </w:r>
-    </w:p>
-    <w:p>
-      <w:pPr>
-        <w:ind w:left="360" w:hanging="240"/>
-        <w:spacing w:before="60" w:after="60" w:line="260" w:lineRule="auto"/>
-      </w:pPr>
-      <w:r>
-        <w:rPr>
-          <w:b/>
-          <w:color w:val="1B4D3E"/>
-          <w:sz w:val="22"/>
-          <w:szCs w:val="22"/>
-        </w:rPr>
-        <w:t xml:space="preserve">•  </w:t>
-      </w:r>
-      <w:r>
-        <w:rPr>
-          <w:b/>
-          <w:color w:val="222222"/>
-          <w:sz w:val="22"/>
-          <w:szCs w:val="22"/>
-        </w:rPr>
-        <w:t xml:space="preserve">Sertifikat Keamanan SSL (HTTPS): </w:t>
-      </w:r>
-      <w:r>
-        <w:rPr>
-          <w:color w:val="444444"/>
-          <w:sz w:val="22"/>
-          <w:szCs w:val="22"/>
-        </w:rPr>
-        <w:t xml:space="preserve">GRATIS (Menggunakan Let's Encrypt / Cloudflare Security).</w:t>
+        <w:t xml:space="preserve">6.1 Garansi Bebas Gangguan (Bug-Free Warranty)</w:t>
+      </w:r>
+    </w:p>
+    <w:p>
+      <w:pPr>
+        <w:spacing w:before="120" w:after="120" w:line="276" w:lineRule="auto"/>
+      </w:pPr>
+      <w:r>
+        <w:rPr/>
+        <w:t xml:space="preserve">Kami memberikan garansi teknis penuh selama 3 (tiga) bulan terhitung sejak tanggal Go-Live. Garansi mencakup perbaikan error teknis, kendala form pendaftaran, atau kegagalan sistem tanpa pungutan biaya tambahan.</w:t>
       </w:r>
     </w:p>
     <w:p>
@@ -5273,103 +6149,21 @@
           <w:sz w:val="25"/>
           <w:szCs w:val="25"/>
         </w:rPr>
-        <w:t xml:space="preserve">4.4 Skema &amp; Tahapan Pembayaran</w:t>
-      </w:r>
-    </w:p>
-    <w:p>
-      <w:pPr>
-        <w:ind w:left="360" w:hanging="240"/>
-        <w:spacing w:before="60" w:after="60" w:line="260" w:lineRule="auto"/>
-      </w:pPr>
-      <w:r>
-        <w:rPr>
-          <w:b/>
-          <w:color w:val="1B4D3E"/>
-          <w:sz w:val="22"/>
-          <w:szCs w:val="22"/>
-        </w:rPr>
-        <w:t xml:space="preserve">•  </w:t>
-      </w:r>
-      <w:r>
-        <w:rPr>
-          <w:b/>
-          <w:color w:val="222222"/>
-          <w:sz w:val="22"/>
-          <w:szCs w:val="22"/>
-        </w:rPr>
-        <w:t xml:space="preserve">Termin I — Uang Muka (DP 40%) : Rp 5.000.000,-: </w:t>
-      </w:r>
-      <w:r>
-        <w:rPr>
-          <w:color w:val="444444"/>
-          <w:sz w:val="22"/>
-          <w:szCs w:val="22"/>
-        </w:rPr>
-        <w:t xml:space="preserve">Dibayarkan saat penandatanganan kesepakatan kerja dan sebelum proyek dimulai sebagai komitmen pengerjaan.</w:t>
-      </w:r>
-    </w:p>
-    <w:p>
-      <w:pPr>
-        <w:ind w:left="360" w:hanging="240"/>
-        <w:spacing w:before="60" w:after="60" w:line="260" w:lineRule="auto"/>
-      </w:pPr>
-      <w:r>
-        <w:rPr>
-          <w:b/>
-          <w:color w:val="1B4D3E"/>
-          <w:sz w:val="22"/>
-          <w:szCs w:val="22"/>
-        </w:rPr>
-        <w:t xml:space="preserve">•  </w:t>
-      </w:r>
-      <w:r>
-        <w:rPr>
-          <w:b/>
-          <w:color w:val="222222"/>
-          <w:sz w:val="22"/>
-          <w:szCs w:val="22"/>
-        </w:rPr>
-        <w:t xml:space="preserve">Termin II — Progres / UAT (40%) : Rp 5.000.000,-: </w:t>
-      </w:r>
-      <w:r>
-        <w:rPr>
-          <w:color w:val="444444"/>
-          <w:sz w:val="22"/>
-          <w:szCs w:val="22"/>
-        </w:rPr>
-        <w:t xml:space="preserve">Dibayarkan saat seluruh sistem selesai dibangun dan dipresentasikan di link demo/staging.</w:t>
-      </w:r>
-    </w:p>
-    <w:p>
-      <w:pPr>
-        <w:ind w:left="360" w:hanging="240"/>
-        <w:spacing w:before="60" w:after="60" w:line="260" w:lineRule="auto"/>
-      </w:pPr>
-      <w:r>
-        <w:rPr>
-          <w:b/>
-          <w:color w:val="1B4D3E"/>
-          <w:sz w:val="22"/>
-          <w:szCs w:val="22"/>
-        </w:rPr>
-        <w:t xml:space="preserve">•  </w:t>
-      </w:r>
-      <w:r>
-        <w:rPr>
-          <w:b/>
-          <w:color w:val="222222"/>
-          <w:sz w:val="22"/>
-          <w:szCs w:val="22"/>
-        </w:rPr>
-        <w:t xml:space="preserve">Termin III — Pelunasan (20%) : Rp 2.500.000,-: </w:t>
-      </w:r>
-      <w:r>
-        <w:rPr>
-          <w:color w:val="444444"/>
-          <w:sz w:val="22"/>
-          <w:szCs w:val="22"/>
-        </w:rPr>
-        <w:t xml:space="preserve">Dibayarkan setelah proses peluncuran resmi (Go-Live) di domain utama dan pelatihan admin selesai.</w:t>
+        <w:t xml:space="preserve">6.2 Pelatihan Administrator (Knowledge Transfer)</w:t>
+      </w:r>
+    </w:p>
+    <w:p>
+      <w:pPr>
+        <w:spacing w:before="120" w:after="120" w:line="276" w:lineRule="auto"/>
+      </w:pPr>
+      <w:r>
+        <w:rPr/>
+        <w:t xml:space="preserve">Untuk memastikan kemandirian pihak yayasan dalam mengelola website, kami menyelenggarakan 1 (satu) sesi pelatihan intensif (secara tatap muka atau daring via Zoom/Google Meet) bagi staf pengelola website dan panitia PPDB, dilengkapi dengan Dokumen Panduan Penggunaan (Manual Guide PDF).</w:t>
+      </w:r>
+    </w:p>
+    <w:p>
+      <w:r>
+        <w:br w:type="page"/>
       </w:r>
     </w:p>
     <w:p>
@@ -5385,7 +6179,7 @@
           <w:sz w:val="28"/>
           <w:szCs w:val="28"/>
         </w:rPr>
-        <w:t xml:space="preserve">BAB V. KEBUTUHAN DATA DARI PIHAK YAYASAN (PREREQUISITES)</w:t>
+        <w:t xml:space="preserve">BAB VII. PENUTUP &amp; LEMBAR PENGESAHAN</w:t>
       </w:r>
     </w:p>
     <w:p>
@@ -5394,7 +6188,17 @@
       </w:pPr>
       <w:r>
         <w:rPr/>
-        <w:t xml:space="preserve">Untuk menjamin kelancaran pengerjaan sesuai timeline, pihak yayasan diharapkan dapat menyediakan data berikut:</w:t>
+        <w:t xml:space="preserve">Demikian proposal penawaran teknis dan finansial ini kami sampaikan. Besar harapan kami agar terjalin kerja sama yang berkah dan berkesinambungan bersama Majlis Al-Ihya Bogor demi mewujudkan ekosistem digital dakwah dan pendidikan Islam yang unggul, profesional, dan berdaya jangkau luas.</w:t>
+      </w:r>
+    </w:p>
+    <w:p>
+      <w:pPr>
+        <w:jc w:val="right"/>
+        <w:spacing w:before="240" w:after="240" w:line="276" w:lineRule="auto"/>
+      </w:pPr>
+      <w:r>
+        <w:rPr/>
+        <w:t xml:space="preserve">Jakarta, September 2026</w:t>
       </w:r>
     </w:p>
     <w:tbl>
@@ -5422,743 +6226,6 @@
         </w:trPr>
         <w:tc>
           <w:tcPr>
-            <w:tcW w:w="600" w:type="dxa"/>
-            <w:shd w:val="clear" w:color="auto" w:fill="1B4D3E"/>
-          </w:tcPr>
-          <w:p>
-            <w:pPr>
-              <w:jc w:val="left"/>
-              <w:spacing w:before="80" w:after="80"/>
-            </w:pPr>
-            <w:r>
-              <w:rPr>
-                <w:b/>
-                <w:color w:val="FFFFFF"/>
-                <w:sz w:val="21"/>
-                <w:rFonts w:ascii="Calibri" w:hAnsi="Calibri"/>
-              </w:rPr>
-              <w:t xml:space="preserve">No</w:t>
-            </w:r>
-          </w:p>
-        </w:tc>
-        <w:tc>
-          <w:tcPr>
-            <w:tcW w:w="2600" w:type="dxa"/>
-            <w:shd w:val="clear" w:color="auto" w:fill="1B4D3E"/>
-          </w:tcPr>
-          <w:p>
-            <w:pPr>
-              <w:jc w:val="left"/>
-              <w:spacing w:before="80" w:after="80"/>
-            </w:pPr>
-            <w:r>
-              <w:rPr>
-                <w:b/>
-                <w:color w:val="FFFFFF"/>
-                <w:sz w:val="21"/>
-                <w:rFonts w:ascii="Calibri" w:hAnsi="Calibri"/>
-              </w:rPr>
-              <w:t xml:space="preserve">Kategori Kebutuhan</w:t>
-            </w:r>
-          </w:p>
-        </w:tc>
-        <w:tc>
-          <w:tcPr>
-            <w:tcW w:w="4500" w:type="dxa"/>
-            <w:shd w:val="clear" w:color="auto" w:fill="1B4D3E"/>
-          </w:tcPr>
-          <w:p>
-            <w:pPr>
-              <w:jc w:val="left"/>
-              <w:spacing w:before="80" w:after="80"/>
-            </w:pPr>
-            <w:r>
-              <w:rPr>
-                <w:b/>
-                <w:color w:val="FFFFFF"/>
-                <w:sz w:val="21"/>
-                <w:rFonts w:ascii="Calibri" w:hAnsi="Calibri"/>
-              </w:rPr>
-              <w:t xml:space="preserve">Rincian Data yang Diperlukan</w:t>
-            </w:r>
-          </w:p>
-        </w:tc>
-        <w:tc>
-          <w:tcPr>
-            <w:tcW w:w="1800" w:type="dxa"/>
-            <w:shd w:val="clear" w:color="auto" w:fill="1B4D3E"/>
-          </w:tcPr>
-          <w:p>
-            <w:pPr>
-              <w:jc w:val="left"/>
-              <w:spacing w:before="80" w:after="80"/>
-            </w:pPr>
-            <w:r>
-              <w:rPr>
-                <w:b/>
-                <w:color w:val="FFFFFF"/>
-                <w:sz w:val="21"/>
-                <w:rFonts w:ascii="Calibri" w:hAnsi="Calibri"/>
-              </w:rPr>
-              <w:t xml:space="preserve">Keterangan</w:t>
-            </w:r>
-          </w:p>
-        </w:tc>
-      </w:tr>
-      <w:tr>
-        <w:tc>
-          <w:tcPr>
-            <w:tcW w:w="600" w:type="dxa"/>
-            <w:shd w:val="clear" w:color="auto" w:fill="FFFFFF"/>
-          </w:tcPr>
-          <w:p>
-            <w:pPr>
-              <w:jc w:val="left"/>
-              <w:spacing w:before="60" w:after="60"/>
-              <w:ind w:left="40" w:right="40"/>
-            </w:pPr>
-            <w:r>
-              <w:rPr>
-                <w:color w:val="333333"/>
-                <w:sz w:val="20"/>
-                <w:rFonts w:ascii="Calibri" w:hAnsi="Calibri"/>
-              </w:rPr>
-              <w:t xml:space="preserve">1</w:t>
-            </w:r>
-          </w:p>
-        </w:tc>
-        <w:tc>
-          <w:tcPr>
-            <w:tcW w:w="2600" w:type="dxa"/>
-            <w:shd w:val="clear" w:color="auto" w:fill="FFFFFF"/>
-          </w:tcPr>
-          <w:p>
-            <w:pPr>
-              <w:jc w:val="left"/>
-              <w:spacing w:before="60" w:after="60"/>
-              <w:ind w:left="40" w:right="40"/>
-            </w:pPr>
-            <w:r>
-              <w:rPr>
-                <w:b/>
-                <w:color w:val="333333"/>
-                <w:sz w:val="20"/>
-                <w:rFonts w:ascii="Calibri" w:hAnsi="Calibri"/>
-              </w:rPr>
-              <w:t xml:space="preserve">Akses Hosting &amp; Domain</w:t>
-            </w:r>
-          </w:p>
-        </w:tc>
-        <w:tc>
-          <w:tcPr>
-            <w:tcW w:w="4500" w:type="dxa"/>
-            <w:shd w:val="clear" w:color="auto" w:fill="FFFFFF"/>
-          </w:tcPr>
-          <w:p>
-            <w:pPr>
-              <w:jc w:val="left"/>
-              <w:spacing w:before="60" w:after="60"/>
-              <w:ind w:left="40" w:right="40"/>
-            </w:pPr>
-            <w:r>
-              <w:rPr>
-                <w:color w:val="333333"/>
-                <w:sz w:val="20"/>
-                <w:rFonts w:ascii="Calibri" w:hAnsi="Calibri"/>
-              </w:rPr>
-              <w:t xml:space="preserve">Informasi login cPanel/panel domain lama (jika sudah memiliki website sebelumnya).</w:t>
-            </w:r>
-          </w:p>
-        </w:tc>
-        <w:tc>
-          <w:tcPr>
-            <w:tcW w:w="1800" w:type="dxa"/>
-            <w:shd w:val="clear" w:color="auto" w:fill="FFFFFF"/>
-          </w:tcPr>
-          <w:p>
-            <w:pPr>
-              <w:jc w:val="left"/>
-              <w:spacing w:before="60" w:after="60"/>
-              <w:ind w:left="40" w:right="40"/>
-            </w:pPr>
-            <w:r>
-              <w:rPr>
-                <w:color w:val="333333"/>
-                <w:sz w:val="20"/>
-                <w:rFonts w:ascii="Calibri" w:hAnsi="Calibri"/>
-              </w:rPr>
-              <w:t xml:space="preserve">Wajib</w:t>
-            </w:r>
-          </w:p>
-        </w:tc>
-      </w:tr>
-      <w:tr>
-        <w:tc>
-          <w:tcPr>
-            <w:tcW w:w="600" w:type="dxa"/>
-            <w:shd w:val="clear" w:color="auto" w:fill="F9FBFA"/>
-          </w:tcPr>
-          <w:p>
-            <w:pPr>
-              <w:jc w:val="left"/>
-              <w:spacing w:before="60" w:after="60"/>
-              <w:ind w:left="40" w:right="40"/>
-            </w:pPr>
-            <w:r>
-              <w:rPr>
-                <w:color w:val="333333"/>
-                <w:sz w:val="20"/>
-                <w:rFonts w:ascii="Calibri" w:hAnsi="Calibri"/>
-              </w:rPr>
-              <w:t xml:space="preserve">2</w:t>
-            </w:r>
-          </w:p>
-        </w:tc>
-        <w:tc>
-          <w:tcPr>
-            <w:tcW w:w="2600" w:type="dxa"/>
-            <w:shd w:val="clear" w:color="auto" w:fill="F9FBFA"/>
-          </w:tcPr>
-          <w:p>
-            <w:pPr>
-              <w:jc w:val="left"/>
-              <w:spacing w:before="60" w:after="60"/>
-              <w:ind w:left="40" w:right="40"/>
-            </w:pPr>
-            <w:r>
-              <w:rPr>
-                <w:b/>
-                <w:color w:val="333333"/>
-                <w:sz w:val="20"/>
-                <w:rFonts w:ascii="Calibri" w:hAnsi="Calibri"/>
-              </w:rPr>
-              <w:t xml:space="preserve">Legalitas Yayasan</w:t>
-            </w:r>
-          </w:p>
-        </w:tc>
-        <w:tc>
-          <w:tcPr>
-            <w:tcW w:w="4500" w:type="dxa"/>
-            <w:shd w:val="clear" w:color="auto" w:fill="F9FBFA"/>
-          </w:tcPr>
-          <w:p>
-            <w:pPr>
-              <w:jc w:val="left"/>
-              <w:spacing w:before="60" w:after="60"/>
-              <w:ind w:left="40" w:right="40"/>
-            </w:pPr>
-            <w:r>
-              <w:rPr>
-                <w:color w:val="333333"/>
-                <w:sz w:val="20"/>
-                <w:rFonts w:ascii="Calibri" w:hAnsi="Calibri"/>
-              </w:rPr>
-              <w:t xml:space="preserve">Scan SK Kemenkumham / Kemenag / Izin Operasional untuk registrasi &amp; administrasi domain majlisalihyabogor.id.</w:t>
-            </w:r>
-          </w:p>
-        </w:tc>
-        <w:tc>
-          <w:tcPr>
-            <w:tcW w:w="1800" w:type="dxa"/>
-            <w:shd w:val="clear" w:color="auto" w:fill="F9FBFA"/>
-          </w:tcPr>
-          <w:p>
-            <w:pPr>
-              <w:jc w:val="left"/>
-              <w:spacing w:before="60" w:after="60"/>
-              <w:ind w:left="40" w:right="40"/>
-            </w:pPr>
-            <w:r>
-              <w:rPr>
-                <w:color w:val="333333"/>
-                <w:sz w:val="20"/>
-                <w:rFonts w:ascii="Calibri" w:hAnsi="Calibri"/>
-              </w:rPr>
-              <w:t xml:space="preserve">Wajib</w:t>
-            </w:r>
-          </w:p>
-        </w:tc>
-      </w:tr>
-      <w:tr>
-        <w:tc>
-          <w:tcPr>
-            <w:tcW w:w="600" w:type="dxa"/>
-            <w:shd w:val="clear" w:color="auto" w:fill="FFFFFF"/>
-          </w:tcPr>
-          <w:p>
-            <w:pPr>
-              <w:jc w:val="left"/>
-              <w:spacing w:before="60" w:after="60"/>
-              <w:ind w:left="40" w:right="40"/>
-            </w:pPr>
-            <w:r>
-              <w:rPr>
-                <w:color w:val="333333"/>
-                <w:sz w:val="20"/>
-                <w:rFonts w:ascii="Calibri" w:hAnsi="Calibri"/>
-              </w:rPr>
-              <w:t xml:space="preserve">3</w:t>
-            </w:r>
-          </w:p>
-        </w:tc>
-        <w:tc>
-          <w:tcPr>
-            <w:tcW w:w="2600" w:type="dxa"/>
-            <w:shd w:val="clear" w:color="auto" w:fill="FFFFFF"/>
-          </w:tcPr>
-          <w:p>
-            <w:pPr>
-              <w:jc w:val="left"/>
-              <w:spacing w:before="60" w:after="60"/>
-              <w:ind w:left="40" w:right="40"/>
-            </w:pPr>
-            <w:r>
-              <w:rPr>
-                <w:b/>
-                <w:color w:val="333333"/>
-                <w:sz w:val="20"/>
-                <w:rFonts w:ascii="Calibri" w:hAnsi="Calibri"/>
-              </w:rPr>
-              <w:t xml:space="preserve">Identitas &amp; Kontak</w:t>
-            </w:r>
-          </w:p>
-        </w:tc>
-        <w:tc>
-          <w:tcPr>
-            <w:tcW w:w="4500" w:type="dxa"/>
-            <w:shd w:val="clear" w:color="auto" w:fill="FFFFFF"/>
-          </w:tcPr>
-          <w:p>
-            <w:pPr>
-              <w:jc w:val="left"/>
-              <w:spacing w:before="60" w:after="60"/>
-              <w:ind w:left="40" w:right="40"/>
-            </w:pPr>
-            <w:r>
-              <w:rPr>
-                <w:color w:val="333333"/>
-                <w:sz w:val="20"/>
-                <w:rFonts w:ascii="Calibri" w:hAnsi="Calibri"/>
-              </w:rPr>
-              <w:t xml:space="preserve">Daftar pengurus inti, nomor WhatsApp &amp; email resmi yayasan, ponpes, madrasah, dan majlis.</w:t>
-            </w:r>
-          </w:p>
-        </w:tc>
-        <w:tc>
-          <w:tcPr>
-            <w:tcW w:w="1800" w:type="dxa"/>
-            <w:shd w:val="clear" w:color="auto" w:fill="FFFFFF"/>
-          </w:tcPr>
-          <w:p>
-            <w:pPr>
-              <w:jc w:val="left"/>
-              <w:spacing w:before="60" w:after="60"/>
-              <w:ind w:left="40" w:right="40"/>
-            </w:pPr>
-            <w:r>
-              <w:rPr>
-                <w:color w:val="333333"/>
-                <w:sz w:val="20"/>
-                <w:rFonts w:ascii="Calibri" w:hAnsi="Calibri"/>
-              </w:rPr>
-              <w:t xml:space="preserve">Wajib</w:t>
-            </w:r>
-          </w:p>
-        </w:tc>
-      </w:tr>
-      <w:tr>
-        <w:tc>
-          <w:tcPr>
-            <w:tcW w:w="600" w:type="dxa"/>
-            <w:shd w:val="clear" w:color="auto" w:fill="F9FBFA"/>
-          </w:tcPr>
-          <w:p>
-            <w:pPr>
-              <w:jc w:val="left"/>
-              <w:spacing w:before="60" w:after="60"/>
-              <w:ind w:left="40" w:right="40"/>
-            </w:pPr>
-            <w:r>
-              <w:rPr>
-                <w:color w:val="333333"/>
-                <w:sz w:val="20"/>
-                <w:rFonts w:ascii="Calibri" w:hAnsi="Calibri"/>
-              </w:rPr>
-              <w:t xml:space="preserve">4</w:t>
-            </w:r>
-          </w:p>
-        </w:tc>
-        <w:tc>
-          <w:tcPr>
-            <w:tcW w:w="2600" w:type="dxa"/>
-            <w:shd w:val="clear" w:color="auto" w:fill="F9FBFA"/>
-          </w:tcPr>
-          <w:p>
-            <w:pPr>
-              <w:jc w:val="left"/>
-              <w:spacing w:before="60" w:after="60"/>
-              <w:ind w:left="40" w:right="40"/>
-            </w:pPr>
-            <w:r>
-              <w:rPr>
-                <w:b/>
-                <w:color w:val="333333"/>
-                <w:sz w:val="20"/>
-                <w:rFonts w:ascii="Calibri" w:hAnsi="Calibri"/>
-              </w:rPr>
-              <w:t xml:space="preserve">Aset Profil &amp; Media</w:t>
-            </w:r>
-          </w:p>
-        </w:tc>
-        <w:tc>
-          <w:tcPr>
-            <w:tcW w:w="4500" w:type="dxa"/>
-            <w:shd w:val="clear" w:color="auto" w:fill="F9FBFA"/>
-          </w:tcPr>
-          <w:p>
-            <w:pPr>
-              <w:jc w:val="left"/>
-              <w:spacing w:before="60" w:after="60"/>
-              <w:ind w:left="40" w:right="40"/>
-            </w:pPr>
-            <w:r>
-              <w:rPr>
-                <w:color w:val="333333"/>
-                <w:sz w:val="20"/>
-                <w:rFonts w:ascii="Calibri" w:hAnsi="Calibri"/>
-              </w:rPr>
-              <w:t xml:space="preserve">Logo resolusi tinggi, foto sarana prasarana, foto pengasuh/asatidz, dan visi-misi yayasan.</w:t>
-            </w:r>
-          </w:p>
-        </w:tc>
-        <w:tc>
-          <w:tcPr>
-            <w:tcW w:w="1800" w:type="dxa"/>
-            <w:shd w:val="clear" w:color="auto" w:fill="F9FBFA"/>
-          </w:tcPr>
-          <w:p>
-            <w:pPr>
-              <w:jc w:val="left"/>
-              <w:spacing w:before="60" w:after="60"/>
-              <w:ind w:left="40" w:right="40"/>
-            </w:pPr>
-            <w:r>
-              <w:rPr>
-                <w:color w:val="333333"/>
-                <w:sz w:val="20"/>
-                <w:rFonts w:ascii="Calibri" w:hAnsi="Calibri"/>
-              </w:rPr>
-              <w:t xml:space="preserve">Wajib</w:t>
-            </w:r>
-          </w:p>
-        </w:tc>
-      </w:tr>
-      <w:tr>
-        <w:tc>
-          <w:tcPr>
-            <w:tcW w:w="600" w:type="dxa"/>
-            <w:shd w:val="clear" w:color="auto" w:fill="FFFFFF"/>
-          </w:tcPr>
-          <w:p>
-            <w:pPr>
-              <w:jc w:val="left"/>
-              <w:spacing w:before="60" w:after="60"/>
-              <w:ind w:left="40" w:right="40"/>
-            </w:pPr>
-            <w:r>
-              <w:rPr>
-                <w:color w:val="333333"/>
-                <w:sz w:val="20"/>
-                <w:rFonts w:ascii="Calibri" w:hAnsi="Calibri"/>
-              </w:rPr>
-              <w:t xml:space="preserve">5</w:t>
-            </w:r>
-          </w:p>
-        </w:tc>
-        <w:tc>
-          <w:tcPr>
-            <w:tcW w:w="2600" w:type="dxa"/>
-            <w:shd w:val="clear" w:color="auto" w:fill="FFFFFF"/>
-          </w:tcPr>
-          <w:p>
-            <w:pPr>
-              <w:jc w:val="left"/>
-              <w:spacing w:before="60" w:after="60"/>
-              <w:ind w:left="40" w:right="40"/>
-            </w:pPr>
-            <w:r>
-              <w:rPr>
-                <w:b/>
-                <w:color w:val="333333"/>
-                <w:sz w:val="20"/>
-                <w:rFonts w:ascii="Calibri" w:hAnsi="Calibri"/>
-              </w:rPr>
-              <w:t xml:space="preserve">Formulir &amp; Alur PPDB</w:t>
-            </w:r>
-          </w:p>
-        </w:tc>
-        <w:tc>
-          <w:tcPr>
-            <w:tcW w:w="4500" w:type="dxa"/>
-            <w:shd w:val="clear" w:color="auto" w:fill="FFFFFF"/>
-          </w:tcPr>
-          <w:p>
-            <w:pPr>
-              <w:jc w:val="left"/>
-              <w:spacing w:before="60" w:after="60"/>
-              <w:ind w:left="40" w:right="40"/>
-            </w:pPr>
-            <w:r>
-              <w:rPr>
-                <w:color w:val="333333"/>
-                <w:sz w:val="20"/>
-                <w:rFonts w:ascii="Calibri" w:hAnsi="Calibri"/>
-              </w:rPr>
-              <w:t xml:space="preserve">Berkas formulir pendaftaran manual tahun lalu, rincian biaya pendaftaran, &amp; no. rekening bank.</w:t>
-            </w:r>
-          </w:p>
-        </w:tc>
-        <w:tc>
-          <w:tcPr>
-            <w:tcW w:w="1800" w:type="dxa"/>
-            <w:shd w:val="clear" w:color="auto" w:fill="FFFFFF"/>
-          </w:tcPr>
-          <w:p>
-            <w:pPr>
-              <w:jc w:val="left"/>
-              <w:spacing w:before="60" w:after="60"/>
-              <w:ind w:left="40" w:right="40"/>
-            </w:pPr>
-            <w:r>
-              <w:rPr>
-                <w:color w:val="333333"/>
-                <w:sz w:val="20"/>
-                <w:rFonts w:ascii="Calibri" w:hAnsi="Calibri"/>
-              </w:rPr>
-              <w:t xml:space="preserve">Wajib</w:t>
-            </w:r>
-          </w:p>
-        </w:tc>
-      </w:tr>
-      <w:tr>
-        <w:tc>
-          <w:tcPr>
-            <w:tcW w:w="600" w:type="dxa"/>
-            <w:shd w:val="clear" w:color="auto" w:fill="F9FBFA"/>
-          </w:tcPr>
-          <w:p>
-            <w:pPr>
-              <w:jc w:val="left"/>
-              <w:spacing w:before="60" w:after="60"/>
-              <w:ind w:left="40" w:right="40"/>
-            </w:pPr>
-            <w:r>
-              <w:rPr>
-                <w:color w:val="333333"/>
-                <w:sz w:val="20"/>
-                <w:rFonts w:ascii="Calibri" w:hAnsi="Calibri"/>
-              </w:rPr>
-              <w:t xml:space="preserve">6</w:t>
-            </w:r>
-          </w:p>
-        </w:tc>
-        <w:tc>
-          <w:tcPr>
-            <w:tcW w:w="2600" w:type="dxa"/>
-            <w:shd w:val="clear" w:color="auto" w:fill="F9FBFA"/>
-          </w:tcPr>
-          <w:p>
-            <w:pPr>
-              <w:jc w:val="left"/>
-              <w:spacing w:before="60" w:after="60"/>
-              <w:ind w:left="40" w:right="40"/>
-            </w:pPr>
-            <w:r>
-              <w:rPr>
-                <w:b/>
-                <w:color w:val="333333"/>
-                <w:sz w:val="20"/>
-                <w:rFonts w:ascii="Calibri" w:hAnsi="Calibri"/>
-              </w:rPr>
-              <w:t xml:space="preserve">Penunjukan Admin Unit</w:t>
-            </w:r>
-          </w:p>
-        </w:tc>
-        <w:tc>
-          <w:tcPr>
-            <w:tcW w:w="4500" w:type="dxa"/>
-            <w:shd w:val="clear" w:color="auto" w:fill="F9FBFA"/>
-          </w:tcPr>
-          <w:p>
-            <w:pPr>
-              <w:jc w:val="left"/>
-              <w:spacing w:before="60" w:after="60"/>
-              <w:ind w:left="40" w:right="40"/>
-            </w:pPr>
-            <w:r>
-              <w:rPr>
-                <w:color w:val="333333"/>
-                <w:sz w:val="20"/>
-                <w:rFonts w:ascii="Calibri" w:hAnsi="Calibri"/>
-              </w:rPr>
-              <w:t xml:space="preserve">Nama dan kontak staf yang ditunjuk menjadi operator web Ponpes, Madrasah, dan Majlis Ta'lim.</w:t>
-            </w:r>
-          </w:p>
-        </w:tc>
-        <w:tc>
-          <w:tcPr>
-            <w:tcW w:w="1800" w:type="dxa"/>
-            <w:shd w:val="clear" w:color="auto" w:fill="F9FBFA"/>
-          </w:tcPr>
-          <w:p>
-            <w:pPr>
-              <w:jc w:val="left"/>
-              <w:spacing w:before="60" w:after="60"/>
-              <w:ind w:left="40" w:right="40"/>
-            </w:pPr>
-            <w:r>
-              <w:rPr>
-                <w:color w:val="333333"/>
-                <w:sz w:val="20"/>
-                <w:rFonts w:ascii="Calibri" w:hAnsi="Calibri"/>
-              </w:rPr>
-              <w:t xml:space="preserve">Wajib</w:t>
-            </w:r>
-          </w:p>
-        </w:tc>
-      </w:tr>
-    </w:tbl>
-    <w:p>
-      <w:pPr>
-        <w:spacing w:before="100" w:after="100" w:line="276" w:lineRule="auto"/>
-      </w:pPr>
-    </w:p>
-    <w:p>
-      <w:pPr>
-        <w:jc w:val="left"/>
-        <w:spacing w:before="360" w:after="140" w:line="276" w:lineRule="auto"/>
-      </w:pPr>
-      <w:r>
-        <w:rPr>
-          <w:rFonts w:ascii="Calibri" w:hAnsi="Calibri"/>
-          <w:b/>
-          <w:color w:val="1B4D3E"/>
-          <w:sz w:val="28"/>
-          <w:szCs w:val="28"/>
-        </w:rPr>
-        <w:t xml:space="preserve">BAB VI. GARANSI, PEMELIHARAAN &amp; PELATIHAN</w:t>
-      </w:r>
-    </w:p>
-    <w:p>
-      <w:pPr>
-        <w:jc w:val="left"/>
-        <w:spacing w:before="240" w:after="100" w:line="276" w:lineRule="auto"/>
-      </w:pPr>
-      <w:r>
-        <w:rPr>
-          <w:rFonts w:ascii="Calibri" w:hAnsi="Calibri"/>
-          <w:b/>
-          <w:color w:val="2E5A44"/>
-          <w:sz w:val="25"/>
-          <w:szCs w:val="25"/>
-        </w:rPr>
-        <w:t xml:space="preserve">6.1 Garansi Bebas Gangguan (Bug-Free Warranty)</w:t>
-      </w:r>
-    </w:p>
-    <w:p>
-      <w:pPr>
-        <w:spacing w:before="120" w:after="120" w:line="276" w:lineRule="auto"/>
-      </w:pPr>
-      <w:r>
-        <w:rPr/>
-        <w:t xml:space="preserve">Kami memberikan garansi teknis penuh selama 3 (tiga) bulan terhitung sejak tanggal Go-Live. Garansi mencakup perbaikan error teknis, kendala form pendaftaran, atau kegagalan sistem tanpa pungutan biaya tambahan.</w:t>
-      </w:r>
-    </w:p>
-    <w:p>
-      <w:pPr>
-        <w:jc w:val="left"/>
-        <w:spacing w:before="240" w:after="100" w:line="276" w:lineRule="auto"/>
-      </w:pPr>
-      <w:r>
-        <w:rPr>
-          <w:rFonts w:ascii="Calibri" w:hAnsi="Calibri"/>
-          <w:b/>
-          <w:color w:val="2E5A44"/>
-          <w:sz w:val="25"/>
-          <w:szCs w:val="25"/>
-        </w:rPr>
-        <w:t xml:space="preserve">6.2 Pelatihan Administrator (Knowledge Transfer)</w:t>
-      </w:r>
-    </w:p>
-    <w:p>
-      <w:pPr>
-        <w:spacing w:before="120" w:after="120" w:line="276" w:lineRule="auto"/>
-      </w:pPr>
-      <w:r>
-        <w:rPr/>
-        <w:t xml:space="preserve">Untuk memastikan kemandirian pihak yayasan dalam mengelola website, kami menyelenggarakan 1 (satu) sesi pelatihan intensif (secara tatap muka atau daring via Zoom/Google Meet) bagi staf pengelola website dan panitia PPDB, dilengkapi dengan Dokumen Panduan Penggunaan (Manual Guide PDF).</w:t>
-      </w:r>
-    </w:p>
-    <w:p>
-      <w:pPr>
-        <w:jc w:val="left"/>
-        <w:spacing w:before="360" w:after="140" w:line="276" w:lineRule="auto"/>
-      </w:pPr>
-      <w:r>
-        <w:rPr>
-          <w:rFonts w:ascii="Calibri" w:hAnsi="Calibri"/>
-          <w:b/>
-          <w:color w:val="1B4D3E"/>
-          <w:sz w:val="28"/>
-          <w:szCs w:val="28"/>
-        </w:rPr>
-        <w:t xml:space="preserve">BAB VII. PENUTUP &amp; LEMBAR PENGESAHAN</w:t>
-      </w:r>
-    </w:p>
-    <w:p>
-      <w:pPr>
-        <w:spacing w:before="120" w:after="120" w:line="276" w:lineRule="auto"/>
-      </w:pPr>
-      <w:r>
-        <w:rPr/>
-        <w:t xml:space="preserve">Demikian proposal penawaran teknis dan finansial ini kami sampaikan. Besar harapan kami agar terjalin kerja sama yang berkah dan berkesinambungan bersama Majlis Al-Ihya Bogor demi mewujudkan ekosistem digital dakwah dan pendidikan Islam yang unggul, profesional, dan berdaya jangkau luas.</w:t>
-      </w:r>
-    </w:p>
-    <w:p>
-      <w:pPr>
-        <w:jc w:val="right"/>
-        <w:spacing w:before="240" w:after="240" w:line="276" w:lineRule="auto"/>
-      </w:pPr>
-      <w:r>
-        <w:rPr/>
-        <w:t xml:space="preserve">Jakarta, September 2026</w:t>
-      </w:r>
-    </w:p>
-    <w:tbl>
-      <w:tblPr>
-        <w:tblW w:w="9500" w:type="dxa"/>
-        <w:jc w:val="center"/>
-        <w:tblBorders>
-          <w:top w:val="single" w:sz="6" w:space="0" w:color="D0D7DE"/>
-          <w:left w:val="none"/>
-          <w:bottom w:val="single" w:sz="8" w:space="0" w:color="1B4D3E"/>
-          <w:right w:val="none"/>
-          <w:insideH w:val="single" w:sz="4" w:space="0" w:color="E1E4E8"/>
-          <w:insideV w:val="none"/>
-        </w:tblBorders>
-        <w:tblCellMar>
-          <w:top w:w="120" w:type="dxa"/>
-          <w:left w:w="140" w:type="dxa"/>
-          <w:bottom w:w="120" w:type="dxa"/>
-          <w:right w:w="140" w:type="dxa"/>
-        </w:tblCellMar>
-      </w:tblPr>
-      <w:tr>
-        <w:trPr>
-          <w:tblHeader/>
-        </w:trPr>
-        <w:tc>
-          <w:tcPr>
             <w:tcW w:w="4750" w:type="dxa"/>
             <w:shd w:val="clear" w:color="auto" w:fill="1B4D3E"/>
           </w:tcPr>
@@ -6255,7 +6322,7 @@
     </w:tbl>
     <w:p>
       <w:pPr>
-        <w:spacing w:before="100" w:after="100" w:line="276" w:lineRule="auto"/>
+        <w:spacing w:before="80" w:after="80" w:line="276" w:lineRule="auto"/>
       </w:pPr>
     </w:p>
     <w:sectPr>

</xml_diff>